<commit_message>
Deploying to gh-pages from @ Morrison-Lab/pds@6bb0696831cefffc74efdd71dddf91d214a131ff 🚀
</commit_message>
<xml_diff>
--- a/expectation.docx
+++ b/expectation.docx
@@ -15,7 +15,7 @@
         <w:pStyle w:val="Date"/>
       </w:pPr>
       <w:r>
-        <w:t xml:space="preserve">Last modified: 2026-09-28 03:12:27 (PDT)</w:t>
+        <w:t xml:space="preserve">Last modified: 2026-09-28 03:31:52 (PDT)</w:t>
       </w:r>
     </w:p>
     <w:p>
@@ -58136,7 +58136,7 @@
               <w:t xml:space="preserve"> </w:t>
             </w:r>
             <w:r>
-              <w:t xml:space="preserve">Rudin (1976)</w:t>
+              <w:t xml:space="preserve">(Rudin 1976, Theorem 3.54, p. 76)</w:t>
             </w:r>
             <w:r>
               <w:t xml:space="preserve"> </w:t>

</xml_diff>

<commit_message>
Deploying to gh-pages from @ Morrison-Lab/pds@2aa71cb81922d4768fc10edea26522e290e17eae 🚀
</commit_message>
<xml_diff>
--- a/expectation.docx
+++ b/expectation.docx
@@ -15,7 +15,7 @@
         <w:pStyle w:val="Date"/>
       </w:pPr>
       <w:r>
-        <w:t xml:space="preserve">Last modified: 2026-09-28 23:45:35 (PDT)</w:t>
+        <w:t xml:space="preserve">Last modified: 2026-09-29 21:32:40 (PDT)</w:t>
       </w:r>
     </w:p>
     <w:p>
@@ -14445,7 +14445,744 @@
       </m:oMathPara>
     </w:p>
     <w:bookmarkEnd w:id="34"/>
-    <w:bookmarkStart w:id="64" w:name="X1b674fb215c38ba7bf07b336b30c333a3581625"/>
+    <w:bookmarkStart w:id="35" w:name="exr-linearity-use"/>
+    <w:p>
+      <w:pPr>
+        <w:pStyle w:val="FirstParagraph"/>
+      </w:pPr>
+      <w:r>
+        <w:rPr>
+          <w:b/>
+          <w:bCs/>
+        </w:rPr>
+        <w:t xml:space="preserve">Exercise 1 (Why the average of a sample is a random variable)</w:t>
+      </w:r>
+      <w:r>
+        <w:t xml:space="preserve"> </w:t>
+      </w:r>
+      <w:r>
+        <w:t xml:space="preserve">Let</w:t>
+      </w:r>
+      <w:r>
+        <w:t xml:space="preserve"> </w:t>
+      </w:r>
+      <m:oMath>
+        <m:sSub>
+          <m:e>
+            <m:r>
+              <m:t>X</m:t>
+            </m:r>
+          </m:e>
+          <m:sub>
+            <m:r>
+              <m:t>1</m:t>
+            </m:r>
+          </m:sub>
+        </m:sSub>
+        <m:r>
+          <m:rPr>
+            <m:sty m:val="p"/>
+          </m:rPr>
+          <m:t>,</m:t>
+        </m:r>
+        <m:r>
+          <m:rPr>
+            <m:sty m:val="p"/>
+          </m:rPr>
+          <m:t>…</m:t>
+        </m:r>
+        <m:r>
+          <m:rPr>
+            <m:sty m:val="p"/>
+          </m:rPr>
+          <m:t>,</m:t>
+        </m:r>
+        <m:sSub>
+          <m:e>
+            <m:r>
+              <m:t>X</m:t>
+            </m:r>
+          </m:e>
+          <m:sub>
+            <m:r>
+              <m:t>n</m:t>
+            </m:r>
+          </m:sub>
+        </m:sSub>
+      </m:oMath>
+      <w:r>
+        <w:t xml:space="preserve"> </w:t>
+      </w:r>
+      <w:r>
+        <w:t xml:space="preserve">be independent draws from the same distribution,</w:t>
+      </w:r>
+      <w:r>
+        <w:t xml:space="preserve"> </w:t>
+      </w:r>
+      <w:r>
+        <w:t xml:space="preserve">each with mean</w:t>
+      </w:r>
+      <w:r>
+        <w:t xml:space="preserve"> </w:t>
+      </w:r>
+      <m:oMath>
+        <m:r>
+          <m:t>μ</m:t>
+        </m:r>
+      </m:oMath>
+      <w:r>
+        <w:t xml:space="preserve"> </w:t>
+      </w:r>
+      <w:r>
+        <w:t xml:space="preserve">and variance</w:t>
+      </w:r>
+      <w:r>
+        <w:t xml:space="preserve"> </w:t>
+      </w:r>
+      <m:oMath>
+        <m:sSup>
+          <m:e>
+            <m:r>
+              <m:t>σ</m:t>
+            </m:r>
+          </m:e>
+          <m:sup>
+            <m:r>
+              <m:t>2</m:t>
+            </m:r>
+          </m:sup>
+        </m:sSup>
+      </m:oMath>
+      <w:r>
+        <w:t xml:space="preserve">,</w:t>
+      </w:r>
+      <w:r>
+        <w:t xml:space="preserve"> </w:t>
+      </w:r>
+      <w:r>
+        <w:t xml:space="preserve">and let</w:t>
+      </w:r>
+      <w:r>
+        <w:t xml:space="preserve"> </w:t>
+      </w:r>
+      <m:oMath>
+        <m:acc>
+          <m:accPr>
+            <m:chr m:val="‾"/>
+          </m:accPr>
+          <m:e>
+            <m:r>
+              <m:t>X</m:t>
+            </m:r>
+          </m:e>
+        </m:acc>
+        <m:r>
+          <m:rPr>
+            <m:sty m:val="p"/>
+          </m:rPr>
+          <m:t>=</m:t>
+        </m:r>
+        <m:f>
+          <m:fPr>
+            <m:type m:val="bar"/>
+          </m:fPr>
+          <m:num>
+            <m:r>
+              <m:t>1</m:t>
+            </m:r>
+          </m:num>
+          <m:den>
+            <m:r>
+              <m:t>n</m:t>
+            </m:r>
+          </m:den>
+        </m:f>
+        <m:nary>
+          <m:naryPr>
+            <m:chr m:val="∑"/>
+            <m:limLoc m:val="undOvr"/>
+            <m:subHide m:val="off"/>
+            <m:supHide m:val="off"/>
+          </m:naryPr>
+          <m:sub>
+            <m:r>
+              <m:t>i</m:t>
+            </m:r>
+            <m:r>
+              <m:rPr>
+                <m:sty m:val="p"/>
+              </m:rPr>
+              <m:t>=</m:t>
+            </m:r>
+            <m:r>
+              <m:t>1</m:t>
+            </m:r>
+          </m:sub>
+          <m:sup>
+            <m:r>
+              <m:t>n</m:t>
+            </m:r>
+          </m:sup>
+          <m:e>
+            <m:sSub>
+              <m:e>
+                <m:r>
+                  <m:t>X</m:t>
+                </m:r>
+              </m:e>
+              <m:sub>
+                <m:r>
+                  <m:t>i</m:t>
+                </m:r>
+              </m:sub>
+            </m:sSub>
+          </m:e>
+        </m:nary>
+      </m:oMath>
+      <w:r>
+        <w:t xml:space="preserve"> </w:t>
+      </w:r>
+      <w:r>
+        <w:t xml:space="preserve">be their average.</w:t>
+      </w:r>
+    </w:p>
+    <w:p>
+      <w:pPr>
+        <w:pStyle w:val="BodyText"/>
+      </w:pPr>
+      <w:r>
+        <w:t xml:space="preserve">Use</w:t>
+      </w:r>
+      <w:r>
+        <w:t xml:space="preserve"> </w:t>
+      </w:r>
+      <w:hyperlink w:anchor="thm-linearity-expectation">
+        <w:r>
+          <w:rPr>
+            <w:rStyle w:val="Hyperlink"/>
+          </w:rPr>
+          <w:t xml:space="preserve">Theorem 4</w:t>
+        </w:r>
+      </w:hyperlink>
+      <w:r>
+        <w:t xml:space="preserve"> </w:t>
+      </w:r>
+      <w:r>
+        <w:t xml:space="preserve">to show that</w:t>
+      </w:r>
+      <w:r>
+        <w:t xml:space="preserve"> </w:t>
+      </w:r>
+      <m:oMath>
+        <m:r>
+          <m:rPr>
+            <m:scr m:val="double-struck"/>
+            <m:sty m:val="p"/>
+          </m:rPr>
+          <m:t>E</m:t>
+        </m:r>
+        <m:r>
+          <m:rPr>
+            <m:sty m:val="p"/>
+          </m:rPr>
+          <m:t>[</m:t>
+        </m:r>
+        <m:acc>
+          <m:accPr>
+            <m:chr m:val="‾"/>
+          </m:accPr>
+          <m:e>
+            <m:r>
+              <m:t>X</m:t>
+            </m:r>
+          </m:e>
+        </m:acc>
+        <m:r>
+          <m:rPr>
+            <m:sty m:val="p"/>
+          </m:rPr>
+          <m:t>]</m:t>
+        </m:r>
+        <m:r>
+          <m:rPr>
+            <m:sty m:val="p"/>
+          </m:rPr>
+          <m:t>=</m:t>
+        </m:r>
+        <m:r>
+          <m:t>μ</m:t>
+        </m:r>
+      </m:oMath>
+      <w:r>
+        <w:t xml:space="preserve">,</w:t>
+      </w:r>
+      <w:r>
+        <w:t xml:space="preserve"> </w:t>
+      </w:r>
+      <w:r>
+        <w:t xml:space="preserve">and say in one sentence what that does</w:t>
+      </w:r>
+      <w:r>
+        <w:t xml:space="preserve"> </w:t>
+      </w:r>
+      <w:r>
+        <w:rPr>
+          <w:i/>
+          <w:iCs/>
+        </w:rPr>
+        <w:t xml:space="preserve">not</w:t>
+      </w:r>
+      <w:r>
+        <w:t xml:space="preserve"> </w:t>
+      </w:r>
+      <w:r>
+        <w:t xml:space="preserve">tell us.</w:t>
+      </w:r>
+    </w:p>
+    <w:bookmarkEnd w:id="35"/>
+    <w:bookmarkStart w:id="36" w:name="sol-linearity-use"/>
+    <w:p>
+      <w:pPr>
+        <w:pStyle w:val="BodyText"/>
+      </w:pPr>
+      <w:r>
+        <w:rPr>
+          <w:i/>
+          <w:iCs/>
+        </w:rPr>
+        <w:t xml:space="preserve">Solution 1</w:t>
+      </w:r>
+      <w:r>
+        <w:t xml:space="preserve">. </w:t>
+      </w:r>
+      <w:r>
+        <w:t xml:space="preserve">Pull the constant</w:t>
+      </w:r>
+      <w:r>
+        <w:t xml:space="preserve"> </w:t>
+      </w:r>
+      <m:oMath>
+        <m:r>
+          <m:t>1</m:t>
+        </m:r>
+        <m:r>
+          <m:rPr>
+            <m:sty m:val="p"/>
+          </m:rPr>
+          <m:t>/</m:t>
+        </m:r>
+        <m:r>
+          <m:t>n</m:t>
+        </m:r>
+      </m:oMath>
+      <w:r>
+        <w:t xml:space="preserve"> </w:t>
+      </w:r>
+      <w:r>
+        <w:t xml:space="preserve">out and split the sum, both by</w:t>
+      </w:r>
+      <w:r>
+        <w:t xml:space="preserve"> </w:t>
+      </w:r>
+      <w:hyperlink w:anchor="thm-linearity-expectation">
+        <w:r>
+          <w:rPr>
+            <w:rStyle w:val="Hyperlink"/>
+          </w:rPr>
+          <w:t xml:space="preserve">Theorem 4</w:t>
+        </w:r>
+      </w:hyperlink>
+      <w:r>
+        <w:t xml:space="preserve">:</w:t>
+      </w:r>
+    </w:p>
+    <w:p>
+      <w:pPr>
+        <w:pStyle w:val="BodyText"/>
+      </w:pPr>
+      <m:oMathPara>
+        <m:oMathParaPr>
+          <m:jc m:val="center"/>
+        </m:oMathParaPr>
+        <m:oMath>
+          <m:r>
+            <m:rPr>
+              <m:scr m:val="double-struck"/>
+              <m:sty m:val="p"/>
+            </m:rPr>
+            <m:t>E</m:t>
+          </m:r>
+          <m:r>
+            <m:rPr>
+              <m:sty m:val="p"/>
+            </m:rPr>
+            <m:t>[</m:t>
+          </m:r>
+          <m:acc>
+            <m:accPr>
+              <m:chr m:val="‾"/>
+            </m:accPr>
+            <m:e>
+              <m:r>
+                <m:t>X</m:t>
+              </m:r>
+            </m:e>
+          </m:acc>
+          <m:r>
+            <m:rPr>
+              <m:sty m:val="p"/>
+            </m:rPr>
+            <m:t>]</m:t>
+          </m:r>
+          <m:r>
+            <m:rPr>
+              <m:sty m:val="p"/>
+            </m:rPr>
+            <m:t>=</m:t>
+          </m:r>
+          <m:r>
+            <m:rPr>
+              <m:scr m:val="double-struck"/>
+              <m:sty m:val="p"/>
+            </m:rPr>
+            <m:t>E</m:t>
+          </m:r>
+          <m:r>
+            <m:t>​</m:t>
+          </m:r>
+          <m:d>
+            <m:dPr>
+              <m:begChr m:val="["/>
+              <m:sepChr m:val=""/>
+              <m:endChr m:val="]"/>
+              <m:grow/>
+            </m:dPr>
+            <m:e>
+              <m:f>
+                <m:fPr>
+                  <m:type m:val="bar"/>
+                </m:fPr>
+                <m:num>
+                  <m:r>
+                    <m:t>1</m:t>
+                  </m:r>
+                </m:num>
+                <m:den>
+                  <m:r>
+                    <m:t>n</m:t>
+                  </m:r>
+                </m:den>
+              </m:f>
+              <m:nary>
+                <m:naryPr>
+                  <m:chr m:val="∑"/>
+                  <m:limLoc m:val="undOvr"/>
+                  <m:subHide m:val="off"/>
+                  <m:supHide m:val="off"/>
+                </m:naryPr>
+                <m:sub>
+                  <m:r>
+                    <m:t>i</m:t>
+                  </m:r>
+                  <m:r>
+                    <m:rPr>
+                      <m:sty m:val="p"/>
+                    </m:rPr>
+                    <m:t>=</m:t>
+                  </m:r>
+                  <m:r>
+                    <m:t>1</m:t>
+                  </m:r>
+                </m:sub>
+                <m:sup>
+                  <m:r>
+                    <m:t>n</m:t>
+                  </m:r>
+                </m:sup>
+                <m:e>
+                  <m:sSub>
+                    <m:e>
+                      <m:r>
+                        <m:t>X</m:t>
+                      </m:r>
+                    </m:e>
+                    <m:sub>
+                      <m:r>
+                        <m:t>i</m:t>
+                      </m:r>
+                    </m:sub>
+                  </m:sSub>
+                </m:e>
+              </m:nary>
+            </m:e>
+          </m:d>
+          <m:r>
+            <m:rPr>
+              <m:sty m:val="p"/>
+            </m:rPr>
+            <m:t>=</m:t>
+          </m:r>
+          <m:f>
+            <m:fPr>
+              <m:type m:val="bar"/>
+            </m:fPr>
+            <m:num>
+              <m:r>
+                <m:t>1</m:t>
+              </m:r>
+            </m:num>
+            <m:den>
+              <m:r>
+                <m:t>n</m:t>
+              </m:r>
+            </m:den>
+          </m:f>
+          <m:nary>
+            <m:naryPr>
+              <m:chr m:val="∑"/>
+              <m:limLoc m:val="undOvr"/>
+              <m:subHide m:val="off"/>
+              <m:supHide m:val="off"/>
+            </m:naryPr>
+            <m:sub>
+              <m:r>
+                <m:t>i</m:t>
+              </m:r>
+              <m:r>
+                <m:rPr>
+                  <m:sty m:val="p"/>
+                </m:rPr>
+                <m:t>=</m:t>
+              </m:r>
+              <m:r>
+                <m:t>1</m:t>
+              </m:r>
+            </m:sub>
+            <m:sup>
+              <m:r>
+                <m:t>n</m:t>
+              </m:r>
+            </m:sup>
+            <m:e>
+              <m:r>
+                <m:rPr>
+                  <m:scr m:val="double-struck"/>
+                  <m:sty m:val="p"/>
+                </m:rPr>
+                <m:t>E</m:t>
+              </m:r>
+            </m:e>
+          </m:nary>
+          <m:r>
+            <m:rPr>
+              <m:sty m:val="p"/>
+            </m:rPr>
+            <m:t>[</m:t>
+          </m:r>
+          <m:sSub>
+            <m:e>
+              <m:r>
+                <m:t>X</m:t>
+              </m:r>
+            </m:e>
+            <m:sub>
+              <m:r>
+                <m:t>i</m:t>
+              </m:r>
+            </m:sub>
+          </m:sSub>
+          <m:r>
+            <m:rPr>
+              <m:sty m:val="p"/>
+            </m:rPr>
+            <m:t>]</m:t>
+          </m:r>
+          <m:r>
+            <m:rPr>
+              <m:sty m:val="p"/>
+            </m:rPr>
+            <m:t>=</m:t>
+          </m:r>
+          <m:f>
+            <m:fPr>
+              <m:type m:val="bar"/>
+            </m:fPr>
+            <m:num>
+              <m:r>
+                <m:t>1</m:t>
+              </m:r>
+            </m:num>
+            <m:den>
+              <m:r>
+                <m:t>n</m:t>
+              </m:r>
+            </m:den>
+          </m:f>
+          <m:r>
+            <m:t> </m:t>
+          </m:r>
+          <m:r>
+            <m:rPr>
+              <m:sty m:val="p"/>
+            </m:rPr>
+            <m:t>(</m:t>
+          </m:r>
+          <m:r>
+            <m:t>n</m:t>
+          </m:r>
+          <m:r>
+            <m:t>μ</m:t>
+          </m:r>
+          <m:r>
+            <m:rPr>
+              <m:sty m:val="p"/>
+            </m:rPr>
+            <m:t>)</m:t>
+          </m:r>
+          <m:r>
+            <m:rPr>
+              <m:sty m:val="p"/>
+            </m:rPr>
+            <m:t>=</m:t>
+          </m:r>
+          <m:r>
+            <m:t>μ</m:t>
+          </m:r>
+        </m:oMath>
+      </m:oMathPara>
+    </w:p>
+    <w:p>
+      <w:pPr>
+        <w:pStyle w:val="FirstParagraph"/>
+      </w:pPr>
+      <w:r>
+        <w:t xml:space="preserve">So the sample average is right</w:t>
+      </w:r>
+      <w:r>
+        <w:t xml:space="preserve"> </w:t>
+      </w:r>
+      <w:r>
+        <w:rPr>
+          <w:i/>
+          <w:iCs/>
+        </w:rPr>
+        <w:t xml:space="preserve">on average</w:t>
+      </w:r>
+      <w:r>
+        <w:t xml:space="preserve">.</w:t>
+      </w:r>
+      <w:r>
+        <w:t xml:space="preserve"> </w:t>
+      </w:r>
+      <w:r>
+        <w:t xml:space="preserve">Independence was never used:</w:t>
+      </w:r>
+      <w:r>
+        <w:t xml:space="preserve"> </w:t>
+      </w:r>
+      <w:hyperlink w:anchor="thm-linearity-expectation">
+        <w:r>
+          <w:rPr>
+            <w:rStyle w:val="Hyperlink"/>
+          </w:rPr>
+          <w:t xml:space="preserve">Theorem 4</w:t>
+        </w:r>
+      </w:hyperlink>
+      <w:r>
+        <w:t xml:space="preserve"> </w:t>
+      </w:r>
+      <w:r>
+        <w:t xml:space="preserve">holds regardless,</w:t>
+      </w:r>
+      <w:r>
+        <w:t xml:space="preserve"> </w:t>
+      </w:r>
+      <w:r>
+        <w:t xml:space="preserve">so this much would be true even for draws that influence one another.</w:t>
+      </w:r>
+    </w:p>
+    <w:p>
+      <w:pPr>
+        <w:pStyle w:val="BodyText"/>
+      </w:pPr>
+      <w:r>
+        <w:t xml:space="preserve">What it does not tell us is how far any</w:t>
+      </w:r>
+      <w:r>
+        <w:t xml:space="preserve"> </w:t>
+      </w:r>
+      <w:r>
+        <w:rPr>
+          <w:i/>
+          <w:iCs/>
+        </w:rPr>
+        <w:t xml:space="preserve">particular</w:t>
+      </w:r>
+      <w:r>
+        <w:t xml:space="preserve"> </w:t>
+      </w:r>
+      <w:r>
+        <w:t xml:space="preserve">sample average falls</w:t>
+      </w:r>
+      <w:r>
+        <w:t xml:space="preserve"> </w:t>
+      </w:r>
+      <w:r>
+        <w:t xml:space="preserve">from</w:t>
+      </w:r>
+      <w:r>
+        <w:t xml:space="preserve"> </w:t>
+      </w:r>
+      <m:oMath>
+        <m:r>
+          <m:t>μ</m:t>
+        </m:r>
+      </m:oMath>
+      <w:r>
+        <w:t xml:space="preserve"> </w:t>
+      </w:r>
+      <w:r>
+        <w:t xml:space="preserve">— that is a statement about variance, not expectation,</w:t>
+      </w:r>
+      <w:r>
+        <w:t xml:space="preserve"> </w:t>
+      </w:r>
+      <w:r>
+        <w:t xml:space="preserve">and it is where independence does the work.</w:t>
+      </w:r>
+      <w:r>
+        <w:t xml:space="preserve"> </w:t>
+      </w:r>
+      <w:r>
+        <w:t xml:space="preserve">The distinction matters because an estimator or fitted model is a function of one</w:t>
+      </w:r>
+      <w:r>
+        <w:t xml:space="preserve"> </w:t>
+      </w:r>
+      <w:r>
+        <w:t xml:space="preserve">particular sample.</w:t>
+      </w:r>
+      <w:r>
+        <w:t xml:space="preserve"> </w:t>
+      </w:r>
+      <w:r>
+        <w:t xml:space="preserve">Knowing that the procedure is right on average says nothing about</w:t>
+      </w:r>
+      <w:r>
+        <w:t xml:space="preserve"> </w:t>
+      </w:r>
+      <w:r>
+        <w:t xml:space="preserve">the estimate actually in front of you,</w:t>
+      </w:r>
+      <w:r>
+        <w:t xml:space="preserve"> </w:t>
+      </w:r>
+      <w:r>
+        <w:t xml:space="preserve">and separating those two statements is foundational to understanding bias and variance.</w:t>
+      </w:r>
+    </w:p>
+    <w:bookmarkEnd w:id="36"/>
+    <w:bookmarkStart w:id="66" w:name="X1b674fb215c38ba7bf07b336b30c333a3581625"/>
     <w:p>
       <w:pPr>
         <w:pStyle w:val="Heading2"/>
@@ -14454,7 +15191,7 @@
         <w:t xml:space="preserve">1 Conditional distributions and expectations</w:t>
       </w:r>
     </w:p>
-    <w:bookmarkStart w:id="36" w:name="def-cond-pmf"/>
+    <w:bookmarkStart w:id="38" w:name="def-cond-pmf"/>
     <w:p>
       <w:pPr>
         <w:pStyle w:val="FirstParagraph"/>
@@ -14503,7 +15240,7 @@
       <w:r>
         <w:t xml:space="preserve"> </w:t>
       </w:r>
-      <w:hyperlink r:id="rId35">
+      <w:hyperlink r:id="rId37">
         <w:r>
           <w:rPr>
             <w:rStyle w:val="Hyperlink"/>
@@ -14807,8 +15544,8 @@
         </m:oMath>
       </m:oMathPara>
     </w:p>
-    <w:bookmarkEnd w:id="36"/>
-    <w:bookmarkStart w:id="40" w:name="exm-cond-pmf"/>
+    <w:bookmarkEnd w:id="38"/>
+    <w:bookmarkStart w:id="42" w:name="exm-cond-pmf"/>
     <w:p>
       <w:pPr>
         <w:pStyle w:val="FirstParagraph"/>
@@ -15440,7 +16177,7 @@
       <w:r>
         <w:t xml:space="preserve"> </w:t>
       </w:r>
-      <w:hyperlink r:id="rId37">
+      <w:hyperlink r:id="rId39">
         <w:r>
           <w:rPr>
             <w:rStyle w:val="Hyperlink"/>
@@ -15521,7 +16258,7 @@
       <w:r>
         <w:t xml:space="preserve"> </w:t>
       </w:r>
-      <w:hyperlink r:id="rId38">
+      <w:hyperlink r:id="rId40">
         <w:r>
           <w:rPr>
             <w:rStyle w:val="Hyperlink"/>
@@ -15541,7 +16278,7 @@
       <w:r>
         <w:t xml:space="preserve"> </w:t>
       </w:r>
-      <w:hyperlink r:id="rId39">
+      <w:hyperlink r:id="rId41">
         <w:r>
           <w:rPr>
             <w:rStyle w:val="Hyperlink"/>
@@ -16347,8 +17084,8 @@
         </m:oMath>
       </m:oMathPara>
     </w:p>
-    <w:bookmarkEnd w:id="40"/>
-    <w:bookmarkStart w:id="43" w:name="def-cond-pdf"/>
+    <w:bookmarkEnd w:id="42"/>
+    <w:bookmarkStart w:id="45" w:name="def-cond-pdf"/>
     <w:p>
       <w:pPr>
         <w:pStyle w:val="FirstParagraph"/>
@@ -16403,7 +17140,7 @@
       <w:r>
         <w:t xml:space="preserve"> </w:t>
       </w:r>
-      <w:hyperlink r:id="rId41">
+      <w:hyperlink r:id="rId43">
         <w:r>
           <w:rPr>
             <w:rStyle w:val="Hyperlink"/>
@@ -16476,7 +17213,7 @@
       <w:r>
         <w:t xml:space="preserve"> </w:t>
       </w:r>
-      <w:hyperlink r:id="rId42">
+      <w:hyperlink r:id="rId44">
         <w:r>
           <w:rPr>
             <w:rStyle w:val="Hyperlink"/>
@@ -16812,8 +17549,8 @@
         </m:oMath>
       </m:oMathPara>
     </w:p>
-    <w:bookmarkEnd w:id="43"/>
-    <w:bookmarkStart w:id="45" w:name="exm-cond-pdf"/>
+    <w:bookmarkEnd w:id="45"/>
+    <w:bookmarkStart w:id="47" w:name="exm-cond-pdf"/>
     <w:p>
       <w:pPr>
         <w:pStyle w:val="FirstParagraph"/>
@@ -18559,7 +19296,7 @@
       <w:r>
         <w:t xml:space="preserve"> </w:t>
       </w:r>
-      <w:hyperlink r:id="rId44">
+      <w:hyperlink r:id="rId46">
         <w:r>
           <w:rPr>
             <w:rStyle w:val="Hyperlink"/>
@@ -21804,8 +22541,8 @@
         </w:tc>
       </w:tr>
     </w:tbl>
-    <w:bookmarkEnd w:id="45"/>
-    <w:bookmarkStart w:id="46" w:name="def-cond-expectation"/>
+    <w:bookmarkEnd w:id="47"/>
+    <w:bookmarkStart w:id="48" w:name="def-cond-expectation"/>
     <w:p>
       <w:pPr>
         <w:pStyle w:val="BodyText"/>
@@ -22439,8 +23176,8 @@
         </m:oMath>
       </m:oMathPara>
     </w:p>
-    <w:bookmarkEnd w:id="46"/>
-    <w:bookmarkStart w:id="47" w:name="exm-cond-expectation"/>
+    <w:bookmarkEnd w:id="48"/>
+    <w:bookmarkStart w:id="49" w:name="exm-cond-expectation"/>
     <w:p>
       <w:pPr>
         <w:pStyle w:val="FirstParagraph"/>
@@ -23567,8 +24304,8 @@
         <w:t xml:space="preserve">.</w:t>
       </w:r>
     </w:p>
-    <w:bookmarkEnd w:id="47"/>
-    <w:bookmarkStart w:id="49" w:name="def-cond-mixed"/>
+    <w:bookmarkEnd w:id="49"/>
+    <w:bookmarkStart w:id="51" w:name="def-cond-mixed"/>
     <w:p>
       <w:pPr>
         <w:pStyle w:val="BodyText"/>
@@ -23618,7 +24355,7 @@
       <w:r>
         <w:t xml:space="preserve"> </w:t>
       </w:r>
-      <w:hyperlink r:id="rId48">
+      <w:hyperlink r:id="rId50">
         <w:r>
           <w:rPr>
             <w:rStyle w:val="Hyperlink"/>
@@ -25246,8 +25983,8 @@
         </m:oMath>
       </m:oMathPara>
     </w:p>
-    <w:bookmarkEnd w:id="49"/>
-    <w:bookmarkStart w:id="50" w:name="exm-cond-mixed"/>
+    <w:bookmarkEnd w:id="51"/>
+    <w:bookmarkStart w:id="52" w:name="exm-cond-mixed"/>
     <w:p>
       <w:pPr>
         <w:pStyle w:val="FirstParagraph"/>
@@ -28225,8 +28962,8 @@
         <w:t xml:space="preserve">of senility symptoms.</w:t>
       </w:r>
     </w:p>
-    <w:bookmarkEnd w:id="50"/>
-    <w:bookmarkStart w:id="51" w:name="def-cond-expectation-function"/>
+    <w:bookmarkEnd w:id="52"/>
+    <w:bookmarkStart w:id="53" w:name="def-cond-expectation-function"/>
     <w:p>
       <w:pPr>
         <w:pStyle w:val="BodyText"/>
@@ -28542,8 +29279,8 @@
         <w:t xml:space="preserve">.</w:t>
       </w:r>
     </w:p>
-    <w:bookmarkEnd w:id="51"/>
-    <w:bookmarkStart w:id="52" w:name="exm-cond-expectation-function"/>
+    <w:bookmarkEnd w:id="53"/>
+    <w:bookmarkStart w:id="54" w:name="exm-cond-expectation-function"/>
     <w:p>
       <w:pPr>
         <w:pStyle w:val="BodyText"/>
@@ -29237,8 +29974,8 @@
         </m:oMath>
       </m:oMathPara>
     </w:p>
-    <w:bookmarkEnd w:id="52"/>
-    <w:bookmarkStart w:id="53" w:name="def-cond-expectation-general"/>
+    <w:bookmarkEnd w:id="54"/>
+    <w:bookmarkStart w:id="55" w:name="def-cond-expectation-general"/>
     <w:p>
       <w:pPr>
         <w:pStyle w:val="FirstParagraph"/>
@@ -30136,8 +30873,8 @@
         <w:t xml:space="preserve">.</w:t>
       </w:r>
     </w:p>
-    <w:bookmarkEnd w:id="53"/>
-    <w:bookmarkStart w:id="55" w:name="exm-cond-expectation-general"/>
+    <w:bookmarkEnd w:id="55"/>
+    <w:bookmarkStart w:id="57" w:name="exm-cond-expectation-general"/>
     <w:p>
       <w:pPr>
         <w:pStyle w:val="BodyText"/>
@@ -30158,7 +30895,7 @@
       <w:r>
         <w:t xml:space="preserve"> </w:t>
       </w:r>
-      <w:hyperlink r:id="rId54">
+      <w:hyperlink r:id="rId56">
         <w:r>
           <w:rPr>
             <w:rStyle w:val="Hyperlink"/>
@@ -30735,8 +31472,8 @@
         </m:oMath>
       </m:oMathPara>
     </w:p>
-    <w:bookmarkEnd w:id="55"/>
-    <w:bookmarkStart w:id="56" w:name="cor-cond-expectation-general-y"/>
+    <w:bookmarkEnd w:id="57"/>
+    <w:bookmarkStart w:id="58" w:name="cor-cond-expectation-general-y"/>
     <w:p>
       <w:pPr>
         <w:pStyle w:val="FirstParagraph"/>
@@ -31188,7 +31925,7 @@
         </m:oMath>
       </m:oMathPara>
     </w:p>
-    <w:bookmarkEnd w:id="56"/>
+    <w:bookmarkEnd w:id="58"/>
     <w:p>
       <w:pPr>
         <w:pStyle w:val="FirstParagraph"/>
@@ -31939,7 +32676,7 @@
         <w:t xml:space="preserve">.</w:t>
       </w:r>
     </w:p>
-    <w:bookmarkStart w:id="57" w:name="thm-cond-lotus"/>
+    <w:bookmarkStart w:id="59" w:name="thm-cond-lotus"/>
     <w:p>
       <w:pPr>
         <w:pStyle w:val="BodyText"/>
@@ -32319,7 +33056,7 @@
         <w:t xml:space="preserve">with one sum converging absolutely exactly when the other does.</w:t>
       </w:r>
     </w:p>
-    <w:bookmarkEnd w:id="57"/>
+    <w:bookmarkEnd w:id="59"/>
     <w:p>
       <w:pPr>
         <w:pStyle w:val="BodyText"/>
@@ -35485,7 +36222,7 @@
         <w:t xml:space="preserve">, with the sum or integral taken over both.</w:t>
       </w:r>
     </w:p>
-    <w:bookmarkStart w:id="58" w:name="thm-cond-linearity"/>
+    <w:bookmarkStart w:id="60" w:name="thm-cond-linearity"/>
     <w:p>
       <w:pPr>
         <w:pStyle w:val="BodyText"/>
@@ -36238,7 +36975,7 @@
         <w:t xml:space="preserve">.</w:t>
       </w:r>
     </w:p>
-    <w:bookmarkEnd w:id="58"/>
+    <w:bookmarkEnd w:id="60"/>
     <w:p>
       <w:pPr>
         <w:pStyle w:val="BodyText"/>
@@ -37135,7 +37872,7 @@
         <w:t xml:space="preserve">against one conditional density.</w:t>
       </w:r>
     </w:p>
-    <w:bookmarkStart w:id="59" w:name="exm-cond-linearity"/>
+    <w:bookmarkStart w:id="61" w:name="exm-cond-linearity"/>
     <w:p>
       <w:pPr>
         <w:pStyle w:val="BodyText"/>
@@ -37932,8 +38669,8 @@
         <w:t xml:space="preserve">.</w:t>
       </w:r>
     </w:p>
-    <w:bookmarkEnd w:id="59"/>
-    <w:bookmarkStart w:id="60" w:name="thm-cond-pull-out"/>
+    <w:bookmarkEnd w:id="61"/>
+    <w:bookmarkStart w:id="62" w:name="thm-cond-pull-out"/>
     <w:p>
       <w:pPr>
         <w:pStyle w:val="BodyText"/>
@@ -38595,7 +39332,7 @@
         <w:t xml:space="preserve">.</w:t>
       </w:r>
     </w:p>
-    <w:bookmarkEnd w:id="60"/>
+    <w:bookmarkEnd w:id="62"/>
     <w:p>
       <w:pPr>
         <w:pStyle w:val="BodyText"/>
@@ -39656,7 +40393,7 @@
       <w:r>
         <w:t xml:space="preserve"> </w:t>
       </w:r>
-      <w:hyperlink r:id="rId42">
+      <w:hyperlink r:id="rId44">
         <w:r>
           <w:rPr>
             <w:rStyle w:val="Hyperlink"/>
@@ -39673,7 +40410,7 @@
       <w:r>
         <w:t xml:space="preserve"> </w:t>
       </w:r>
-      <w:hyperlink r:id="rId48">
+      <w:hyperlink r:id="rId50">
         <w:r>
           <w:rPr>
             <w:rStyle w:val="Hyperlink"/>
@@ -39781,7 +40518,7 @@
         <w:t xml:space="preserve">.</w:t>
       </w:r>
     </w:p>
-    <w:bookmarkStart w:id="61" w:name="exm-cond-pull-out"/>
+    <w:bookmarkStart w:id="63" w:name="exm-cond-pull-out"/>
     <w:p>
       <w:pPr>
         <w:pStyle w:val="BodyText"/>
@@ -40389,8 +41126,8 @@
         <w:t xml:space="preserve">each.</w:t>
       </w:r>
     </w:p>
-    <w:bookmarkEnd w:id="61"/>
-    <w:bookmarkStart w:id="62" w:name="exr-fubini-joint-disc"/>
+    <w:bookmarkEnd w:id="63"/>
+    <w:bookmarkStart w:id="64" w:name="exr-fubini-joint-disc"/>
     <w:p>
       <w:pPr>
         <w:pStyle w:val="BodyText"/>
@@ -40400,7 +41137,7 @@
           <w:b/>
           <w:bCs/>
         </w:rPr>
-        <w:t xml:space="preserve">Exercise 1 (Expectation of a sum, given a joint PMF)</w:t>
+        <w:t xml:space="preserve">Exercise 2 (Expectation of a sum, given a joint PMF)</w:t>
       </w:r>
       <w:r>
         <w:t xml:space="preserve"> </w:t>
@@ -40695,7 +41432,7 @@
         <w:t xml:space="preserve">.</w:t>
       </w:r>
     </w:p>
-    <w:bookmarkEnd w:id="62"/>
+    <w:bookmarkEnd w:id="64"/>
     <w:p>
       <w:pPr>
         <w:pStyle w:val="BodyText"/>
@@ -41825,7 +42562,7 @@
       <w:tr>
         <w:tc>
           <w:tcPr/>
-          <w:bookmarkStart w:id="63" w:name="fig-fubini-joint-disc"/>
+          <w:bookmarkStart w:id="65" w:name="fig-fubini-joint-disc"/>
           <w:p>
             <w:pPr>
               <w:pStyle w:val="Compact"/>
@@ -42102,7 +42839,7 @@
               <w:t xml:space="preserve">.</w:t>
             </w:r>
           </w:p>
-          <w:bookmarkEnd w:id="63"/>
+          <w:bookmarkEnd w:id="65"/>
         </w:tc>
       </w:tr>
     </w:tbl>
@@ -42418,8 +43155,8 @@
         <w:t xml:space="preserve">which the Fubini–Tonelli theorem provides.</w:t>
       </w:r>
     </w:p>
-    <w:bookmarkEnd w:id="64"/>
-    <w:bookmarkStart w:id="85" w:name="fubinitonelli-for-expectations"/>
+    <w:bookmarkEnd w:id="66"/>
+    <w:bookmarkStart w:id="87" w:name="fubinitonelli-for-expectations"/>
     <w:p>
       <w:pPr>
         <w:pStyle w:val="Heading2"/>
@@ -42428,7 +43165,7 @@
         <w:t xml:space="preserve">2 Fubini–Tonelli for expectations</w:t>
       </w:r>
     </w:p>
-    <w:bookmarkStart w:id="66" w:name="thm-fubini-tonelli-measure"/>
+    <w:bookmarkStart w:id="68" w:name="thm-fubini-tonelli-measure"/>
     <w:p>
       <w:pPr>
         <w:pStyle w:val="FirstParagraph"/>
@@ -42506,7 +43243,7 @@
       <w:r>
         <w:t xml:space="preserve"> </w:t>
       </w:r>
-      <w:hyperlink r:id="rId65">
+      <w:hyperlink r:id="rId67">
         <w:r>
           <w:rPr>
             <w:rStyle w:val="Hyperlink"/>
@@ -43443,7 +44180,7 @@
         <w:t xml:space="preserve">, which does not affect the outer integral.</w:t>
       </w:r>
     </w:p>
-    <w:bookmarkEnd w:id="66"/>
+    <w:bookmarkEnd w:id="68"/>
     <w:p>
       <w:pPr>
         <w:pStyle w:val="BodyText"/>
@@ -43534,7 +44271,7 @@
       <w:r>
         <w:t xml:space="preserve"> </w:t>
       </w:r>
-      <w:hyperlink r:id="rId67">
+      <w:hyperlink r:id="rId69">
         <w:r>
           <w:rPr>
             <w:rStyle w:val="Hyperlink"/>
@@ -43572,7 +44309,7 @@
         <w:t xml:space="preserve">which gives the theorem a form stated in terms of a joint distribution.</w:t>
       </w:r>
     </w:p>
-    <w:bookmarkStart w:id="68" w:name="cor-fubini-joint"/>
+    <w:bookmarkStart w:id="70" w:name="cor-fubini-joint"/>
     <w:p>
       <w:pPr>
         <w:pStyle w:val="BodyText"/>
@@ -45255,7 +45992,7 @@
       <w:r>
         <w:t xml:space="preserve"> </w:t>
       </w:r>
-      <w:hyperlink r:id="rId48">
+      <w:hyperlink r:id="rId50">
         <w:r>
           <w:rPr>
             <w:rStyle w:val="Hyperlink"/>
@@ -45575,7 +46312,7 @@
         <w:t xml:space="preserve">.</w:t>
       </w:r>
     </w:p>
-    <w:bookmarkEnd w:id="68"/>
+    <w:bookmarkEnd w:id="70"/>
     <w:p>
       <w:pPr>
         <w:pStyle w:val="FirstParagraph"/>
@@ -46319,7 +47056,7 @@
         <w:t xml:space="preserve">and the iterated integrals factor into separate integrals over the marginals.</w:t>
       </w:r>
     </w:p>
-    <w:bookmarkStart w:id="69" w:name="exm-fubini-prob"/>
+    <w:bookmarkStart w:id="71" w:name="exm-fubini-prob"/>
     <w:p>
       <w:pPr>
         <w:pStyle w:val="BodyText"/>
@@ -47831,8 +48568,8 @@
         <w:t xml:space="preserve">.</w:t>
       </w:r>
     </w:p>
-    <w:bookmarkEnd w:id="69"/>
-    <w:bookmarkStart w:id="71" w:name="exm-fubini-prob-fail"/>
+    <w:bookmarkEnd w:id="71"/>
+    <w:bookmarkStart w:id="73" w:name="exm-fubini-prob-fail"/>
     <w:p>
       <w:pPr>
         <w:pStyle w:val="BodyText"/>
@@ -50751,7 +51488,7 @@
       <w:tr>
         <w:tc>
           <w:tcPr/>
-          <w:bookmarkStart w:id="70" w:name="fig-fubini-prob-fail"/>
+          <w:bookmarkStart w:id="72" w:name="fig-fubini-prob-fail"/>
           <w:p>
             <w:pPr>
               <w:pStyle w:val="Compact"/>
@@ -51138,12 +51875,12 @@
               <w:t xml:space="preserve">(the grey distribution).</w:t>
             </w:r>
           </w:p>
-          <w:bookmarkEnd w:id="70"/>
+          <w:bookmarkEnd w:id="72"/>
         </w:tc>
       </w:tr>
     </w:tbl>
-    <w:bookmarkEnd w:id="71"/>
-    <w:bookmarkStart w:id="73" w:name="exm-fubini-joint"/>
+    <w:bookmarkEnd w:id="73"/>
+    <w:bookmarkStart w:id="75" w:name="exm-fubini-joint"/>
     <w:p>
       <w:pPr>
         <w:pStyle w:val="BodyText"/>
@@ -52093,7 +52830,7 @@
       <w:tr>
         <w:tc>
           <w:tcPr/>
-          <w:bookmarkStart w:id="72" w:name="fig-fubini-joint"/>
+          <w:bookmarkStart w:id="74" w:name="fig-fubini-joint"/>
           <w:p>
             <w:pPr>
               <w:pStyle w:val="Compact"/>
@@ -52324,12 +53061,12 @@
               <w:t xml:space="preserve">, as required.</w:t>
             </w:r>
           </w:p>
-          <w:bookmarkEnd w:id="72"/>
+          <w:bookmarkEnd w:id="74"/>
         </w:tc>
       </w:tr>
     </w:tbl>
-    <w:bookmarkEnd w:id="73"/>
-    <w:bookmarkStart w:id="74" w:name="thm-lie"/>
+    <w:bookmarkEnd w:id="75"/>
+    <w:bookmarkStart w:id="76" w:name="thm-lie"/>
     <w:p>
       <w:pPr>
         <w:pStyle w:val="BodyText"/>
@@ -52536,7 +53273,7 @@
         </m:oMath>
       </m:oMathPara>
     </w:p>
-    <w:bookmarkEnd w:id="74"/>
+    <w:bookmarkEnd w:id="76"/>
     <w:p>
       <w:pPr>
         <w:pStyle w:val="FirstParagraph"/>
@@ -52685,7 +53422,7 @@
       <w:r>
         <w:t xml:space="preserve"> </w:t>
       </w:r>
-      <w:hyperlink r:id="rId75">
+      <w:hyperlink r:id="rId77">
         <w:r>
           <w:rPr>
             <w:rStyle w:val="Hyperlink"/>
@@ -55153,7 +55890,7 @@
       <w:r>
         <w:t xml:space="preserve"> </w:t>
       </w:r>
-      <w:hyperlink r:id="rId48">
+      <w:hyperlink r:id="rId50">
         <w:r>
           <w:rPr>
             <w:rStyle w:val="Hyperlink"/>
@@ -57507,7 +58244,7 @@
         <w:t xml:space="preserve">.</w:t>
       </w:r>
     </w:p>
-    <w:bookmarkStart w:id="76" w:name="thm-conditional-lie"/>
+    <w:bookmarkStart w:id="78" w:name="thm-conditional-lie"/>
     <w:p>
       <w:pPr>
         <w:pStyle w:val="BodyText"/>
@@ -57749,7 +58486,7 @@
         </m:oMath>
       </m:oMathPara>
     </w:p>
-    <w:bookmarkEnd w:id="76"/>
+    <w:bookmarkEnd w:id="78"/>
     <w:p>
       <w:pPr>
         <w:pStyle w:val="FirstParagraph"/>
@@ -60285,7 +61022,7 @@
         <w:t xml:space="preserve">.</w:t>
       </w:r>
     </w:p>
-    <w:bookmarkStart w:id="77" w:name="exm-lie"/>
+    <w:bookmarkStart w:id="79" w:name="exm-lie"/>
     <w:p>
       <w:pPr>
         <w:pStyle w:val="BodyText"/>
@@ -61012,8 +61749,8 @@
         </m:oMath>
       </m:oMathPara>
     </w:p>
-    <w:bookmarkEnd w:id="77"/>
-    <w:bookmarkStart w:id="78" w:name="exr-fubini-joint-disc-infinite"/>
+    <w:bookmarkEnd w:id="79"/>
+    <w:bookmarkStart w:id="80" w:name="exr-fubini-joint-disc-infinite"/>
     <w:p>
       <w:pPr>
         <w:pStyle w:val="FirstParagraph"/>
@@ -61023,7 +61760,7 @@
           <w:b/>
           <w:bCs/>
         </w:rPr>
-        <w:t xml:space="preserve">Exercise 2 (Both-discrete case, infinite support: joint PMF)</w:t>
+        <w:t xml:space="preserve">Exercise 3 (Both-discrete case, infinite support: joint PMF)</w:t>
       </w:r>
       <w:r>
         <w:t xml:space="preserve"> </w:t>
@@ -61375,7 +62112,7 @@
           <w:rPr>
             <w:rStyle w:val="Hyperlink"/>
           </w:rPr>
-          <w:t xml:space="preserve">Exercise 1</w:t>
+          <w:t xml:space="preserve">Exercise 2</w:t>
         </w:r>
       </w:hyperlink>
       <w:r>
@@ -61560,7 +62297,7 @@
         <w:t xml:space="preserve">.</w:t>
       </w:r>
     </w:p>
-    <w:bookmarkEnd w:id="78"/>
+    <w:bookmarkEnd w:id="80"/>
     <w:p>
       <w:pPr>
         <w:pStyle w:val="BodyText"/>
@@ -65020,18 +65757,18 @@
                 <wp:inline>
                   <wp:extent cx="152400" cy="152400"/>
                   <wp:effectExtent b="0" l="0" r="0" t="0"/>
-                  <wp:docPr descr="" title="" id="80" name="Picture"/>
+                  <wp:docPr descr="" title="" id="82" name="Picture"/>
                   <a:graphic>
                     <a:graphicData uri="http://schemas.openxmlformats.org/drawingml/2006/picture">
                       <pic:pic>
                         <pic:nvPicPr>
-                          <pic:cNvPr descr="/opt/quarto/share/formats/docx/note.png" id="81" name="Picture"/>
+                          <pic:cNvPr descr="/opt/quarto/share/formats/docx/note.png" id="83" name="Picture"/>
                           <pic:cNvPicPr>
                             <a:picLocks noChangeArrowheads="1" noChangeAspect="1"/>
                           </pic:cNvPicPr>
                         </pic:nvPicPr>
                         <pic:blipFill>
-                          <a:blip r:embed="rId79"/>
+                          <a:blip r:embed="rId81"/>
                           <a:stretch>
                             <a:fillRect/>
                           </a:stretch>
@@ -65098,7 +65835,7 @@
                 <w:rPr>
                   <w:rStyle w:val="Hyperlink"/>
                 </w:rPr>
-                <w:t xml:space="preserve">Exercise 2</w:t>
+                <w:t xml:space="preserve">Exercise 3</w:t>
               </w:r>
             </w:hyperlink>
             <w:r>
@@ -66181,7 +66918,7 @@
         </w:tc>
       </w:tr>
     </w:tbl>
-    <w:bookmarkStart w:id="82" w:name="exr-fubini-joint-mixed"/>
+    <w:bookmarkStart w:id="84" w:name="exr-fubini-joint-mixed"/>
     <w:p>
       <w:pPr>
         <w:pStyle w:val="BodyText"/>
@@ -66191,7 +66928,7 @@
           <w:b/>
           <w:bCs/>
         </w:rPr>
-        <w:t xml:space="preserve">Exercise 3 (Mixed case: one continuous variable, one discrete variable)</w:t>
+        <w:t xml:space="preserve">Exercise 4 (Mixed case: one continuous variable, one discrete variable)</w:t>
       </w:r>
       <w:r>
         <w:t xml:space="preserve"> </w:t>
@@ -66469,7 +67206,7 @@
         <w:t xml:space="preserve">.</w:t>
       </w:r>
     </w:p>
-    <w:bookmarkEnd w:id="82"/>
+    <w:bookmarkEnd w:id="84"/>
     <w:p>
       <w:pPr>
         <w:pStyle w:val="BodyText"/>
@@ -67995,7 +68732,7 @@
       <w:tr>
         <w:tc>
           <w:tcPr/>
-          <w:bookmarkStart w:id="83" w:name="fig-fubini-joint-mixed"/>
+          <w:bookmarkStart w:id="85" w:name="fig-fubini-joint-mixed"/>
           <w:p>
             <w:pPr>
               <w:pStyle w:val="Compact"/>
@@ -68287,7 +69024,7 @@
               <w:t xml:space="preserve">summing to 1.</w:t>
             </w:r>
           </w:p>
-          <w:bookmarkEnd w:id="83"/>
+          <w:bookmarkEnd w:id="85"/>
         </w:tc>
       </w:tr>
     </w:tbl>
@@ -68599,7 +69336,7 @@
         <w:t xml:space="preserve">’s guarantee would be load-bearing.</w:t>
       </w:r>
     </w:p>
-    <w:bookmarkStart w:id="84" w:name="exr-fubini-joint-mixed-infinite"/>
+    <w:bookmarkStart w:id="86" w:name="exr-fubini-joint-mixed-infinite"/>
     <w:p>
       <w:pPr>
         <w:pStyle w:val="BodyText"/>
@@ -68609,7 +69346,7 @@
           <w:b/>
           <w:bCs/>
         </w:rPr>
-        <w:t xml:space="preserve">Exercise 4 (Mixed case, infinite discrete support)</w:t>
+        <w:t xml:space="preserve">Exercise 5 (Mixed case, infinite discrete support)</w:t>
       </w:r>
       <w:r>
         <w:t xml:space="preserve"> </w:t>
@@ -68970,7 +69707,7 @@
           <w:rPr>
             <w:rStyle w:val="Hyperlink"/>
           </w:rPr>
-          <w:t xml:space="preserve">Exercise 3</w:t>
+          <w:t xml:space="preserve">Exercise 4</w:t>
         </w:r>
       </w:hyperlink>
       <w:r>
@@ -69029,7 +69766,7 @@
         <w:t xml:space="preserve">.</w:t>
       </w:r>
     </w:p>
-    <w:bookmarkEnd w:id="84"/>
+    <w:bookmarkEnd w:id="86"/>
     <w:p>
       <w:pPr>
         <w:pStyle w:val="BodyText"/>
@@ -69592,7 +70329,7 @@
           <w:rPr>
             <w:rStyle w:val="Hyperlink"/>
           </w:rPr>
-          <w:t xml:space="preserve">Exercise 3</w:t>
+          <w:t xml:space="preserve">Exercise 4</w:t>
         </w:r>
       </w:hyperlink>
       <w:r>
@@ -71040,7 +71777,7 @@
           <w:rPr>
             <w:rStyle w:val="Hyperlink"/>
           </w:rPr>
-          <w:t xml:space="preserve">Exercise 2</w:t>
+          <w:t xml:space="preserve">Exercise 3</w:t>
         </w:r>
       </w:hyperlink>
       <w:r>
@@ -72682,8 +73419,8 @@
         <w:t xml:space="preserve">.</w:t>
       </w:r>
     </w:p>
-    <w:bookmarkEnd w:id="85"/>
-    <w:bookmarkStart w:id="99" w:name="references"/>
+    <w:bookmarkEnd w:id="87"/>
+    <w:bookmarkStart w:id="101" w:name="references"/>
     <w:p>
       <w:pPr>
         <w:pStyle w:val="Heading2"/>
@@ -72692,8 +73429,8 @@
         <w:t xml:space="preserve">References</w:t>
       </w:r>
     </w:p>
-    <w:bookmarkStart w:id="98" w:name="refs"/>
-    <w:bookmarkStart w:id="86" w:name="ref-billingsley1995probability"/>
+    <w:bookmarkStart w:id="100" w:name="refs"/>
+    <w:bookmarkStart w:id="88" w:name="ref-billingsley1995probability"/>
     <w:p>
       <w:pPr>
         <w:pStyle w:val="Bibliography"/>
@@ -72715,8 +73452,8 @@
         <w:t xml:space="preserve">. 3rd ed. Wiley Series in Probability and Mathematical Statistics. Wiley.</w:t>
       </w:r>
     </w:p>
-    <w:bookmarkEnd w:id="86"/>
-    <w:bookmarkStart w:id="88" w:name="ref-CaseBerg01"/>
+    <w:bookmarkEnd w:id="88"/>
+    <w:bookmarkStart w:id="90" w:name="ref-CaseBerg01"/>
     <w:p>
       <w:pPr>
         <w:pStyle w:val="Bibliography"/>
@@ -72740,7 +73477,7 @@
       <w:r>
         <w:t xml:space="preserve"> </w:t>
       </w:r>
-      <w:hyperlink r:id="rId87">
+      <w:hyperlink r:id="rId89">
         <w:r>
           <w:rPr>
             <w:rStyle w:val="Hyperlink"/>
@@ -72752,8 +73489,8 @@
         <w:t xml:space="preserve">.</w:t>
       </w:r>
     </w:p>
-    <w:bookmarkEnd w:id="88"/>
-    <w:bookmarkStart w:id="90" w:name="ref-dobson4e"/>
+    <w:bookmarkEnd w:id="90"/>
+    <w:bookmarkStart w:id="92" w:name="ref-dobson4e"/>
     <w:p>
       <w:pPr>
         <w:pStyle w:val="Bibliography"/>
@@ -72777,7 +73514,7 @@
       <w:r>
         <w:t xml:space="preserve"> </w:t>
       </w:r>
-      <w:hyperlink r:id="rId89">
+      <w:hyperlink r:id="rId91">
         <w:r>
           <w:rPr>
             <w:rStyle w:val="Hyperlink"/>
@@ -72789,8 +73526,8 @@
         <w:t xml:space="preserve">.</w:t>
       </w:r>
     </w:p>
-    <w:bookmarkEnd w:id="90"/>
-    <w:bookmarkStart w:id="92" w:name="ref-gut2013"/>
+    <w:bookmarkEnd w:id="92"/>
+    <w:bookmarkStart w:id="94" w:name="ref-gut2013"/>
     <w:p>
       <w:pPr>
         <w:pStyle w:val="Bibliography"/>
@@ -72814,7 +73551,7 @@
       <w:r>
         <w:t xml:space="preserve"> </w:t>
       </w:r>
-      <w:hyperlink r:id="rId91">
+      <w:hyperlink r:id="rId93">
         <w:r>
           <w:rPr>
             <w:rStyle w:val="Hyperlink"/>
@@ -72826,8 +73563,8 @@
         <w:t xml:space="preserve">.</w:t>
       </w:r>
     </w:p>
-    <w:bookmarkEnd w:id="92"/>
-    <w:bookmarkStart w:id="93" w:name="ref-rudin1976principles"/>
+    <w:bookmarkEnd w:id="94"/>
+    <w:bookmarkStart w:id="95" w:name="ref-rudin1976principles"/>
     <w:p>
       <w:pPr>
         <w:pStyle w:val="Bibliography"/>
@@ -72849,8 +73586,8 @@
         <w:t xml:space="preserve">. 3rd ed. International Series in Pure and Applied Mathematics. McGraw-Hill.</w:t>
       </w:r>
     </w:p>
-    <w:bookmarkEnd w:id="93"/>
-    <w:bookmarkStart w:id="95" w:name="ref-statproofbook:mean-nnrvar"/>
+    <w:bookmarkEnd w:id="95"/>
+    <w:bookmarkStart w:id="97" w:name="ref-statproofbook:mean-nnrvar"/>
     <w:p>
       <w:pPr>
         <w:pStyle w:val="Bibliography"/>
@@ -72874,7 +73611,7 @@
       <w:r>
         <w:t xml:space="preserve"> </w:t>
       </w:r>
-      <w:hyperlink r:id="rId94">
+      <w:hyperlink r:id="rId96">
         <w:r>
           <w:rPr>
             <w:rStyle w:val="Hyperlink"/>
@@ -72886,8 +73623,8 @@
         <w:t xml:space="preserve">.</w:t>
       </w:r>
     </w:p>
-    <w:bookmarkEnd w:id="95"/>
-    <w:bookmarkStart w:id="97" w:name="ref-wp:lotus"/>
+    <w:bookmarkEnd w:id="97"/>
+    <w:bookmarkStart w:id="99" w:name="ref-wp:lotus"/>
     <w:p>
       <w:pPr>
         <w:pStyle w:val="Bibliography"/>
@@ -72946,7 +73683,7 @@
       <w:r>
         <w:t xml:space="preserve"> </w:t>
       </w:r>
-      <w:hyperlink r:id="rId96">
+      <w:hyperlink r:id="rId98">
         <w:r>
           <w:rPr>
             <w:rStyle w:val="Hyperlink"/>
@@ -72958,9 +73695,9 @@
         <w:t xml:space="preserve">.</w:t>
       </w:r>
     </w:p>
-    <w:bookmarkEnd w:id="97"/>
-    <w:bookmarkEnd w:id="98"/>
     <w:bookmarkEnd w:id="99"/>
+    <w:bookmarkEnd w:id="100"/>
+    <w:bookmarkEnd w:id="101"/>
     <w:sectPr>
       <w:footnotePr>
         <w:numRestart w:val="eachSect"/>

</xml_diff>

<commit_message>
Deploying to gh-pages from @ Morrison-Lab/pds@9b75e319ee09914d8336bddc632f4173e96f1c37 🚀
</commit_message>
<xml_diff>
--- a/expectation.docx
+++ b/expectation.docx
@@ -15,7 +15,7 @@
         <w:pStyle w:val="Date"/>
       </w:pPr>
       <w:r>
-        <w:t xml:space="preserve">Last modified: 2026-10-02 01:19:44 (PDT)</w:t>
+        <w:t xml:space="preserve">Last modified: 2026-10-02 09:59:42 (PDT)</w:t>
       </w:r>
     </w:p>
     <w:p>
@@ -73420,17 +73420,3065 @@
       </w:r>
     </w:p>
     <w:bookmarkEnd w:id="87"/>
-    <w:bookmarkStart w:id="101" w:name="references"/>
+    <w:bookmarkStart w:id="92" w:name="sec-loss-risk"/>
     <w:p>
       <w:pPr>
         <w:pStyle w:val="Heading2"/>
       </w:pPr>
       <w:r>
+        <w:t xml:space="preserve">3 Loss and risk</w:t>
+      </w:r>
+    </w:p>
+    <w:bookmarkStart w:id="88" w:name="exr-loss"/>
+    <w:p>
+      <w:pPr>
+        <w:pStyle w:val="FirstParagraph"/>
+      </w:pPr>
+      <w:r>
+        <w:rPr>
+          <w:b/>
+          <w:bCs/>
+        </w:rPr>
+        <w:t xml:space="preserve">Exercise 6 (Squared and absolute loss)</w:t>
+      </w:r>
+      <w:r>
+        <w:t xml:space="preserve"> </w:t>
+      </w:r>
+      <w:r>
+        <w:t xml:space="preserve"> </w:t>
+      </w:r>
+    </w:p>
+    <w:p>
+      <w:pPr>
+        <w:numPr>
+          <w:ilvl w:val="0"/>
+          <w:numId w:val="1004"/>
+        </w:numPr>
+      </w:pPr>
+      <w:r>
+        <w:t xml:space="preserve">For a true value</w:t>
+      </w:r>
+      <w:r>
+        <w:t xml:space="preserve"> </w:t>
+      </w:r>
+      <m:oMath>
+        <m:r>
+          <m:t>y</m:t>
+        </m:r>
+        <m:r>
+          <m:rPr>
+            <m:sty m:val="p"/>
+          </m:rPr>
+          <m:t>=</m:t>
+        </m:r>
+        <m:r>
+          <m:t>3</m:t>
+        </m:r>
+      </m:oMath>
+      <w:r>
+        <w:t xml:space="preserve"> </w:t>
+      </w:r>
+      <w:r>
+        <w:t xml:space="preserve">and a prediction</w:t>
+      </w:r>
+      <w:r>
+        <w:t xml:space="preserve"> </w:t>
+      </w:r>
+      <m:oMath>
+        <m:acc>
+          <m:accPr>
+            <m:chr m:val="̂"/>
+          </m:accPr>
+          <m:e>
+            <m:r>
+              <m:t>y</m:t>
+            </m:r>
+          </m:e>
+        </m:acc>
+        <m:r>
+          <m:rPr>
+            <m:sty m:val="p"/>
+          </m:rPr>
+          <m:t>=</m:t>
+        </m:r>
+        <m:r>
+          <m:t>5</m:t>
+        </m:r>
+      </m:oMath>
+      <w:r>
+        <w:t xml:space="preserve">,</w:t>
+      </w:r>
+      <w:r>
+        <w:t xml:space="preserve"> </w:t>
+      </w:r>
+      <w:r>
+        <w:t xml:space="preserve">compute the squared error loss</w:t>
+      </w:r>
+      <w:r>
+        <w:t xml:space="preserve"> </w:t>
+      </w:r>
+      <m:oMath>
+        <m:r>
+          <m:t>​</m:t>
+        </m:r>
+        <m:sSup>
+          <m:e>
+            <m:d>
+              <m:dPr>
+                <m:begChr m:val="("/>
+                <m:sepChr m:val=""/>
+                <m:endChr m:val=")"/>
+                <m:grow/>
+              </m:dPr>
+              <m:e>
+                <m:r>
+                  <m:t>y</m:t>
+                </m:r>
+                <m:r>
+                  <m:rPr>
+                    <m:sty m:val="p"/>
+                  </m:rPr>
+                  <m:t>−</m:t>
+                </m:r>
+                <m:acc>
+                  <m:accPr>
+                    <m:chr m:val="̂"/>
+                  </m:accPr>
+                  <m:e>
+                    <m:r>
+                      <m:t>y</m:t>
+                    </m:r>
+                  </m:e>
+                </m:acc>
+              </m:e>
+            </m:d>
+          </m:e>
+          <m:sup>
+            <m:r>
+              <m:t>2</m:t>
+            </m:r>
+          </m:sup>
+        </m:sSup>
+        <m:r>
+          <m:t>​</m:t>
+        </m:r>
+      </m:oMath>
+      <w:r>
+        <w:t xml:space="preserve"> </w:t>
+      </w:r>
+      <w:r>
+        <w:t xml:space="preserve">and the absolute error loss</w:t>
+      </w:r>
+      <w:r>
+        <w:t xml:space="preserve"> </w:t>
+      </w:r>
+      <m:oMath>
+        <m:r>
+          <m:t>​</m:t>
+        </m:r>
+        <m:d>
+          <m:dPr>
+            <m:begChr m:val="|"/>
+            <m:sepChr m:val=""/>
+            <m:endChr m:val="|"/>
+            <m:grow/>
+          </m:dPr>
+          <m:e>
+            <m:r>
+              <m:t>y</m:t>
+            </m:r>
+            <m:r>
+              <m:rPr>
+                <m:sty m:val="p"/>
+              </m:rPr>
+              <m:t>−</m:t>
+            </m:r>
+            <m:acc>
+              <m:accPr>
+                <m:chr m:val="̂"/>
+              </m:accPr>
+              <m:e>
+                <m:r>
+                  <m:t>y</m:t>
+                </m:r>
+              </m:e>
+            </m:acc>
+          </m:e>
+        </m:d>
+        <m:r>
+          <m:t>​</m:t>
+        </m:r>
+      </m:oMath>
+      <w:r>
+        <w:t xml:space="preserve">.</w:t>
+      </w:r>
+    </w:p>
+    <w:p>
+      <w:pPr>
+        <w:numPr>
+          <w:ilvl w:val="0"/>
+          <w:numId w:val="1004"/>
+        </w:numPr>
+      </w:pPr>
+      <w:r>
+        <w:t xml:space="preserve">A random variable</w:t>
+      </w:r>
+      <w:r>
+        <w:t xml:space="preserve"> </w:t>
+      </w:r>
+      <m:oMath>
+        <m:r>
+          <m:t>Y</m:t>
+        </m:r>
+      </m:oMath>
+      <w:r>
+        <w:t xml:space="preserve"> </w:t>
+      </w:r>
+      <w:r>
+        <w:t xml:space="preserve">has</w:t>
+      </w:r>
+      <w:r>
+        <w:t xml:space="preserve"> </w:t>
+      </w:r>
+      <m:oMath>
+        <m:r>
+          <m:rPr>
+            <m:sty m:val="p"/>
+          </m:rPr>
+          <m:t>P</m:t>
+        </m:r>
+        <m:r>
+          <m:rPr>
+            <m:sty m:val="p"/>
+          </m:rPr>
+          <m:t>(</m:t>
+        </m:r>
+        <m:r>
+          <m:t>Y</m:t>
+        </m:r>
+        <m:r>
+          <m:rPr>
+            <m:sty m:val="p"/>
+          </m:rPr>
+          <m:t>=</m:t>
+        </m:r>
+        <m:r>
+          <m:t>0</m:t>
+        </m:r>
+        <m:r>
+          <m:rPr>
+            <m:sty m:val="p"/>
+          </m:rPr>
+          <m:t>)</m:t>
+        </m:r>
+        <m:r>
+          <m:rPr>
+            <m:sty m:val="p"/>
+          </m:rPr>
+          <m:t>=</m:t>
+        </m:r>
+        <m:r>
+          <m:t>0.5</m:t>
+        </m:r>
+      </m:oMath>
+      <w:r>
+        <w:t xml:space="preserve"> </w:t>
+      </w:r>
+      <w:r>
+        <w:t xml:space="preserve">and</w:t>
+      </w:r>
+      <w:r>
+        <w:t xml:space="preserve"> </w:t>
+      </w:r>
+      <m:oMath>
+        <m:r>
+          <m:rPr>
+            <m:sty m:val="p"/>
+          </m:rPr>
+          <m:t>P</m:t>
+        </m:r>
+        <m:r>
+          <m:rPr>
+            <m:sty m:val="p"/>
+          </m:rPr>
+          <m:t>(</m:t>
+        </m:r>
+        <m:r>
+          <m:t>Y</m:t>
+        </m:r>
+        <m:r>
+          <m:rPr>
+            <m:sty m:val="p"/>
+          </m:rPr>
+          <m:t>=</m:t>
+        </m:r>
+        <m:r>
+          <m:t>4</m:t>
+        </m:r>
+        <m:r>
+          <m:rPr>
+            <m:sty m:val="p"/>
+          </m:rPr>
+          <m:t>)</m:t>
+        </m:r>
+        <m:r>
+          <m:rPr>
+            <m:sty m:val="p"/>
+          </m:rPr>
+          <m:t>=</m:t>
+        </m:r>
+        <m:r>
+          <m:t>0.5</m:t>
+        </m:r>
+      </m:oMath>
+      <w:r>
+        <w:t xml:space="preserve">.</w:t>
+      </w:r>
+      <w:r>
+        <w:t xml:space="preserve"> </w:t>
+      </w:r>
+      <w:r>
+        <w:t xml:space="preserve">For the constant prediction</w:t>
+      </w:r>
+      <w:r>
+        <w:t xml:space="preserve"> </w:t>
+      </w:r>
+      <m:oMath>
+        <m:r>
+          <m:t>c</m:t>
+        </m:r>
+        <m:r>
+          <m:rPr>
+            <m:sty m:val="p"/>
+          </m:rPr>
+          <m:t>=</m:t>
+        </m:r>
+        <m:r>
+          <m:t>1</m:t>
+        </m:r>
+      </m:oMath>
+      <w:r>
+        <w:t xml:space="preserve">,</w:t>
+      </w:r>
+      <w:r>
+        <w:t xml:space="preserve"> </w:t>
+      </w:r>
+      <w:r>
+        <w:t xml:space="preserve">compute the expected squared error loss</w:t>
+      </w:r>
+      <w:r>
+        <w:t xml:space="preserve"> </w:t>
+      </w:r>
+      <m:oMath>
+        <m:r>
+          <m:rPr>
+            <m:sty m:val="p"/>
+          </m:rPr>
+          <m:t>E</m:t>
+        </m:r>
+        <m:r>
+          <m:t>​</m:t>
+        </m:r>
+        <m:d>
+          <m:dPr>
+            <m:begChr m:val="["/>
+            <m:sepChr m:val=""/>
+            <m:endChr m:val="]"/>
+            <m:grow/>
+          </m:dPr>
+          <m:e>
+            <m:r>
+              <m:t>​</m:t>
+            </m:r>
+            <m:sSup>
+              <m:e>
+                <m:d>
+                  <m:dPr>
+                    <m:begChr m:val="("/>
+                    <m:sepChr m:val=""/>
+                    <m:endChr m:val=")"/>
+                    <m:grow/>
+                  </m:dPr>
+                  <m:e>
+                    <m:r>
+                      <m:t>Y</m:t>
+                    </m:r>
+                    <m:r>
+                      <m:rPr>
+                        <m:sty m:val="p"/>
+                      </m:rPr>
+                      <m:t>−</m:t>
+                    </m:r>
+                    <m:r>
+                      <m:t>c</m:t>
+                    </m:r>
+                  </m:e>
+                </m:d>
+              </m:e>
+              <m:sup>
+                <m:r>
+                  <m:t>2</m:t>
+                </m:r>
+              </m:sup>
+            </m:sSup>
+            <m:r>
+              <m:t>​</m:t>
+            </m:r>
+          </m:e>
+        </m:d>
+        <m:r>
+          <m:t>​</m:t>
+        </m:r>
+      </m:oMath>
+      <w:r>
+        <w:t xml:space="preserve"> </w:t>
+      </w:r>
+      <w:r>
+        <w:t xml:space="preserve">and the expected absolute error loss</w:t>
+      </w:r>
+      <w:r>
+        <w:t xml:space="preserve"> </w:t>
+      </w:r>
+      <m:oMath>
+        <m:r>
+          <m:rPr>
+            <m:sty m:val="p"/>
+          </m:rPr>
+          <m:t>E</m:t>
+        </m:r>
+        <m:r>
+          <m:t>​</m:t>
+        </m:r>
+        <m:d>
+          <m:dPr>
+            <m:begChr m:val="["/>
+            <m:sepChr m:val=""/>
+            <m:endChr m:val="]"/>
+            <m:grow/>
+          </m:dPr>
+          <m:e>
+            <m:r>
+              <m:t>​</m:t>
+            </m:r>
+            <m:d>
+              <m:dPr>
+                <m:begChr m:val="|"/>
+                <m:sepChr m:val=""/>
+                <m:endChr m:val="|"/>
+                <m:grow/>
+              </m:dPr>
+              <m:e>
+                <m:r>
+                  <m:t>Y</m:t>
+                </m:r>
+                <m:r>
+                  <m:rPr>
+                    <m:sty m:val="p"/>
+                  </m:rPr>
+                  <m:t>−</m:t>
+                </m:r>
+                <m:r>
+                  <m:t>c</m:t>
+                </m:r>
+              </m:e>
+            </m:d>
+            <m:r>
+              <m:t>​</m:t>
+            </m:r>
+          </m:e>
+        </m:d>
+        <m:r>
+          <m:t>​</m:t>
+        </m:r>
+      </m:oMath>
+      <w:r>
+        <w:t xml:space="preserve">.</w:t>
+      </w:r>
+    </w:p>
+    <w:p>
+      <w:pPr>
+        <w:numPr>
+          <w:ilvl w:val="0"/>
+          <w:numId w:val="1004"/>
+        </w:numPr>
+      </w:pPr>
+      <w:r>
+        <w:t xml:space="preserve">Repeat part 2 for</w:t>
+      </w:r>
+      <w:r>
+        <w:t xml:space="preserve"> </w:t>
+      </w:r>
+      <m:oMath>
+        <m:r>
+          <m:t>c</m:t>
+        </m:r>
+        <m:r>
+          <m:rPr>
+            <m:sty m:val="p"/>
+          </m:rPr>
+          <m:t>=</m:t>
+        </m:r>
+        <m:r>
+          <m:t>2</m:t>
+        </m:r>
+      </m:oMath>
+      <w:r>
+        <w:t xml:space="preserve">.</w:t>
+      </w:r>
+    </w:p>
+    <w:p>
+      <w:pPr>
+        <w:numPr>
+          <w:ilvl w:val="0"/>
+          <w:numId w:val="1004"/>
+        </w:numPr>
+      </w:pPr>
+      <w:r>
+        <w:t xml:space="preserve">Which of</w:t>
+      </w:r>
+      <w:r>
+        <w:t xml:space="preserve"> </w:t>
+      </w:r>
+      <m:oMath>
+        <m:r>
+          <m:t>c</m:t>
+        </m:r>
+        <m:r>
+          <m:rPr>
+            <m:sty m:val="p"/>
+          </m:rPr>
+          <m:t>=</m:t>
+        </m:r>
+        <m:r>
+          <m:t>1</m:t>
+        </m:r>
+      </m:oMath>
+      <w:r>
+        <w:t xml:space="preserve"> </w:t>
+      </w:r>
+      <w:r>
+        <w:t xml:space="preserve">and</w:t>
+      </w:r>
+      <w:r>
+        <w:t xml:space="preserve"> </w:t>
+      </w:r>
+      <m:oMath>
+        <m:r>
+          <m:t>c</m:t>
+        </m:r>
+        <m:r>
+          <m:rPr>
+            <m:sty m:val="p"/>
+          </m:rPr>
+          <m:t>=</m:t>
+        </m:r>
+        <m:r>
+          <m:t>2</m:t>
+        </m:r>
+      </m:oMath>
+      <w:r>
+        <w:t xml:space="preserve"> </w:t>
+      </w:r>
+      <w:r>
+        <w:t xml:space="preserve">gives the smaller expected loss under each loss?</w:t>
+      </w:r>
+    </w:p>
+    <w:bookmarkEnd w:id="88"/>
+    <w:bookmarkStart w:id="89" w:name="sol-loss"/>
+    <w:p>
+      <w:pPr>
+        <w:pStyle w:val="FirstParagraph"/>
+      </w:pPr>
+      <w:r>
+        <w:rPr>
+          <w:i/>
+          <w:iCs/>
+        </w:rPr>
+        <w:t xml:space="preserve">Solution 2</w:t>
+      </w:r>
+      <w:r>
+        <w:t xml:space="preserve">. </w:t>
+      </w:r>
+    </w:p>
+    <w:p>
+      <w:pPr>
+        <w:numPr>
+          <w:ilvl w:val="0"/>
+          <w:numId w:val="1005"/>
+        </w:numPr>
+      </w:pPr>
+      <w:r>
+        <w:t xml:space="preserve">For squared error loss:</w:t>
+      </w:r>
+    </w:p>
+    <w:p>
+      <w:pPr>
+        <w:pStyle w:val="BodyText"/>
+      </w:pPr>
+      <m:oMathPara>
+        <m:oMathParaPr>
+          <m:jc m:val="center"/>
+        </m:oMathParaPr>
+        <m:oMath>
+          <m:r>
+            <m:t>​</m:t>
+          </m:r>
+          <m:sSup>
+            <m:e>
+              <m:d>
+                <m:dPr>
+                  <m:begChr m:val="("/>
+                  <m:sepChr m:val=""/>
+                  <m:endChr m:val=")"/>
+                  <m:grow/>
+                </m:dPr>
+                <m:e>
+                  <m:r>
+                    <m:t>3</m:t>
+                  </m:r>
+                  <m:r>
+                    <m:rPr>
+                      <m:sty m:val="p"/>
+                    </m:rPr>
+                    <m:t>−</m:t>
+                  </m:r>
+                  <m:r>
+                    <m:t>5</m:t>
+                  </m:r>
+                </m:e>
+              </m:d>
+            </m:e>
+            <m:sup>
+              <m:r>
+                <m:t>2</m:t>
+              </m:r>
+            </m:sup>
+          </m:sSup>
+          <m:r>
+            <m:t>​</m:t>
+          </m:r>
+          <m:r>
+            <m:rPr>
+              <m:sty m:val="p"/>
+            </m:rPr>
+            <m:t>=</m:t>
+          </m:r>
+          <m:r>
+            <m:t>4</m:t>
+          </m:r>
+        </m:oMath>
+      </m:oMathPara>
+    </w:p>
+    <w:p>
+      <w:pPr>
+        <w:numPr>
+          <w:ilvl w:val="0"/>
+          <w:numId w:val="1000"/>
+        </w:numPr>
+      </w:pPr>
+      <w:r>
+        <w:t xml:space="preserve">For absolute error loss:</w:t>
+      </w:r>
+    </w:p>
+    <w:p>
+      <w:pPr>
+        <w:pStyle w:val="BodyText"/>
+      </w:pPr>
+      <m:oMathPara>
+        <m:oMathParaPr>
+          <m:jc m:val="center"/>
+        </m:oMathParaPr>
+        <m:oMath>
+          <m:r>
+            <m:t>​</m:t>
+          </m:r>
+          <m:d>
+            <m:dPr>
+              <m:begChr m:val="|"/>
+              <m:sepChr m:val=""/>
+              <m:endChr m:val="|"/>
+              <m:grow/>
+            </m:dPr>
+            <m:e>
+              <m:r>
+                <m:t>3</m:t>
+              </m:r>
+              <m:r>
+                <m:rPr>
+                  <m:sty m:val="p"/>
+                </m:rPr>
+                <m:t>−</m:t>
+              </m:r>
+              <m:r>
+                <m:t>5</m:t>
+              </m:r>
+            </m:e>
+          </m:d>
+          <m:r>
+            <m:t>​</m:t>
+          </m:r>
+          <m:r>
+            <m:rPr>
+              <m:sty m:val="p"/>
+            </m:rPr>
+            <m:t>=</m:t>
+          </m:r>
+          <m:r>
+            <m:t>2</m:t>
+          </m:r>
+        </m:oMath>
+      </m:oMathPara>
+    </w:p>
+    <w:p>
+      <w:pPr>
+        <w:numPr>
+          <w:ilvl w:val="0"/>
+          <w:numId w:val="1005"/>
+        </w:numPr>
+      </w:pPr>
+      <w:r>
+        <w:t xml:space="preserve">For</w:t>
+      </w:r>
+      <w:r>
+        <w:t xml:space="preserve"> </w:t>
+      </w:r>
+      <m:oMath>
+        <m:r>
+          <m:t>c</m:t>
+        </m:r>
+        <m:r>
+          <m:rPr>
+            <m:sty m:val="p"/>
+          </m:rPr>
+          <m:t>=</m:t>
+        </m:r>
+        <m:r>
+          <m:t>1</m:t>
+        </m:r>
+      </m:oMath>
+      <w:r>
+        <w:t xml:space="preserve">:</w:t>
+      </w:r>
+      <w:r>
+        <w:t xml:space="preserve"> </w:t>
+      </w:r>
+      <w:r>
+        <w:t xml:space="preserve">The expected squared error loss is:</w:t>
+      </w:r>
+    </w:p>
+    <w:p>
+      <w:pPr>
+        <w:pStyle w:val="BodyText"/>
+      </w:pPr>
+      <m:oMathPara>
+        <m:oMathParaPr>
+          <m:jc m:val="center"/>
+        </m:oMathParaPr>
+        <m:oMath>
+          <m:r>
+            <m:rPr>
+              <m:sty m:val="p"/>
+            </m:rPr>
+            <m:t>E</m:t>
+          </m:r>
+          <m:r>
+            <m:t>​</m:t>
+          </m:r>
+          <m:d>
+            <m:dPr>
+              <m:begChr m:val="["/>
+              <m:sepChr m:val=""/>
+              <m:endChr m:val="]"/>
+              <m:grow/>
+            </m:dPr>
+            <m:e>
+              <m:r>
+                <m:t>​</m:t>
+              </m:r>
+              <m:sSup>
+                <m:e>
+                  <m:d>
+                    <m:dPr>
+                      <m:begChr m:val="("/>
+                      <m:sepChr m:val=""/>
+                      <m:endChr m:val=")"/>
+                      <m:grow/>
+                    </m:dPr>
+                    <m:e>
+                      <m:r>
+                        <m:t>Y</m:t>
+                      </m:r>
+                      <m:r>
+                        <m:rPr>
+                          <m:sty m:val="p"/>
+                        </m:rPr>
+                        <m:t>−</m:t>
+                      </m:r>
+                      <m:r>
+                        <m:t>1</m:t>
+                      </m:r>
+                    </m:e>
+                  </m:d>
+                </m:e>
+                <m:sup>
+                  <m:r>
+                    <m:t>2</m:t>
+                  </m:r>
+                </m:sup>
+              </m:sSup>
+              <m:r>
+                <m:t>​</m:t>
+              </m:r>
+            </m:e>
+          </m:d>
+          <m:r>
+            <m:t>​</m:t>
+          </m:r>
+          <m:r>
+            <m:rPr>
+              <m:sty m:val="p"/>
+            </m:rPr>
+            <m:t>=</m:t>
+          </m:r>
+          <m:r>
+            <m:t>0.5</m:t>
+          </m:r>
+          <m:r>
+            <m:rPr>
+              <m:sty m:val="p"/>
+            </m:rPr>
+            <m:t>⋅</m:t>
+          </m:r>
+          <m:r>
+            <m:t>​</m:t>
+          </m:r>
+          <m:sSup>
+            <m:e>
+              <m:d>
+                <m:dPr>
+                  <m:begChr m:val="("/>
+                  <m:sepChr m:val=""/>
+                  <m:endChr m:val=")"/>
+                  <m:grow/>
+                </m:dPr>
+                <m:e>
+                  <m:r>
+                    <m:t>0</m:t>
+                  </m:r>
+                  <m:r>
+                    <m:rPr>
+                      <m:sty m:val="p"/>
+                    </m:rPr>
+                    <m:t>−</m:t>
+                  </m:r>
+                  <m:r>
+                    <m:t>1</m:t>
+                  </m:r>
+                </m:e>
+              </m:d>
+            </m:e>
+            <m:sup>
+              <m:r>
+                <m:t>2</m:t>
+              </m:r>
+            </m:sup>
+          </m:sSup>
+          <m:r>
+            <m:t>​</m:t>
+          </m:r>
+          <m:r>
+            <m:rPr>
+              <m:sty m:val="p"/>
+            </m:rPr>
+            <m:t>+</m:t>
+          </m:r>
+          <m:r>
+            <m:t>0.5</m:t>
+          </m:r>
+          <m:r>
+            <m:rPr>
+              <m:sty m:val="p"/>
+            </m:rPr>
+            <m:t>⋅</m:t>
+          </m:r>
+          <m:r>
+            <m:t>​</m:t>
+          </m:r>
+          <m:sSup>
+            <m:e>
+              <m:d>
+                <m:dPr>
+                  <m:begChr m:val="("/>
+                  <m:sepChr m:val=""/>
+                  <m:endChr m:val=")"/>
+                  <m:grow/>
+                </m:dPr>
+                <m:e>
+                  <m:r>
+                    <m:t>4</m:t>
+                  </m:r>
+                  <m:r>
+                    <m:rPr>
+                      <m:sty m:val="p"/>
+                    </m:rPr>
+                    <m:t>−</m:t>
+                  </m:r>
+                  <m:r>
+                    <m:t>1</m:t>
+                  </m:r>
+                </m:e>
+              </m:d>
+            </m:e>
+            <m:sup>
+              <m:r>
+                <m:t>2</m:t>
+              </m:r>
+            </m:sup>
+          </m:sSup>
+          <m:r>
+            <m:t>​</m:t>
+          </m:r>
+          <m:r>
+            <m:rPr>
+              <m:sty m:val="p"/>
+            </m:rPr>
+            <m:t>=</m:t>
+          </m:r>
+          <m:r>
+            <m:t>0.5</m:t>
+          </m:r>
+          <m:r>
+            <m:rPr>
+              <m:sty m:val="p"/>
+            </m:rPr>
+            <m:t>⋅</m:t>
+          </m:r>
+          <m:r>
+            <m:t>1</m:t>
+          </m:r>
+          <m:r>
+            <m:rPr>
+              <m:sty m:val="p"/>
+            </m:rPr>
+            <m:t>+</m:t>
+          </m:r>
+          <m:r>
+            <m:t>0.5</m:t>
+          </m:r>
+          <m:r>
+            <m:rPr>
+              <m:sty m:val="p"/>
+            </m:rPr>
+            <m:t>⋅</m:t>
+          </m:r>
+          <m:r>
+            <m:t>9</m:t>
+          </m:r>
+          <m:r>
+            <m:rPr>
+              <m:sty m:val="p"/>
+            </m:rPr>
+            <m:t>=</m:t>
+          </m:r>
+          <m:r>
+            <m:t>5</m:t>
+          </m:r>
+        </m:oMath>
+      </m:oMathPara>
+    </w:p>
+    <w:p>
+      <w:pPr>
+        <w:numPr>
+          <w:ilvl w:val="0"/>
+          <w:numId w:val="1000"/>
+        </w:numPr>
+      </w:pPr>
+      <w:r>
+        <w:t xml:space="preserve">The expected absolute error loss is:</w:t>
+      </w:r>
+    </w:p>
+    <w:p>
+      <w:pPr>
+        <w:pStyle w:val="BodyText"/>
+      </w:pPr>
+      <m:oMathPara>
+        <m:oMathParaPr>
+          <m:jc m:val="center"/>
+        </m:oMathParaPr>
+        <m:oMath>
+          <m:r>
+            <m:rPr>
+              <m:sty m:val="p"/>
+            </m:rPr>
+            <m:t>E</m:t>
+          </m:r>
+          <m:r>
+            <m:t>​</m:t>
+          </m:r>
+          <m:d>
+            <m:dPr>
+              <m:begChr m:val="["/>
+              <m:sepChr m:val=""/>
+              <m:endChr m:val="]"/>
+              <m:grow/>
+            </m:dPr>
+            <m:e>
+              <m:r>
+                <m:t>​</m:t>
+              </m:r>
+              <m:d>
+                <m:dPr>
+                  <m:begChr m:val="|"/>
+                  <m:sepChr m:val=""/>
+                  <m:endChr m:val="|"/>
+                  <m:grow/>
+                </m:dPr>
+                <m:e>
+                  <m:r>
+                    <m:t>Y</m:t>
+                  </m:r>
+                  <m:r>
+                    <m:rPr>
+                      <m:sty m:val="p"/>
+                    </m:rPr>
+                    <m:t>−</m:t>
+                  </m:r>
+                  <m:r>
+                    <m:t>1</m:t>
+                  </m:r>
+                </m:e>
+              </m:d>
+              <m:r>
+                <m:t>​</m:t>
+              </m:r>
+            </m:e>
+          </m:d>
+          <m:r>
+            <m:t>​</m:t>
+          </m:r>
+          <m:r>
+            <m:rPr>
+              <m:sty m:val="p"/>
+            </m:rPr>
+            <m:t>=</m:t>
+          </m:r>
+          <m:r>
+            <m:t>0.5</m:t>
+          </m:r>
+          <m:r>
+            <m:rPr>
+              <m:sty m:val="p"/>
+            </m:rPr>
+            <m:t>⋅</m:t>
+          </m:r>
+          <m:r>
+            <m:t>​</m:t>
+          </m:r>
+          <m:d>
+            <m:dPr>
+              <m:begChr m:val="|"/>
+              <m:sepChr m:val=""/>
+              <m:endChr m:val="|"/>
+              <m:grow/>
+            </m:dPr>
+            <m:e>
+              <m:r>
+                <m:t>0</m:t>
+              </m:r>
+              <m:r>
+                <m:rPr>
+                  <m:sty m:val="p"/>
+                </m:rPr>
+                <m:t>−</m:t>
+              </m:r>
+              <m:r>
+                <m:t>1</m:t>
+              </m:r>
+            </m:e>
+          </m:d>
+          <m:r>
+            <m:t>​</m:t>
+          </m:r>
+          <m:r>
+            <m:rPr>
+              <m:sty m:val="p"/>
+            </m:rPr>
+            <m:t>+</m:t>
+          </m:r>
+          <m:r>
+            <m:t>0.5</m:t>
+          </m:r>
+          <m:r>
+            <m:rPr>
+              <m:sty m:val="p"/>
+            </m:rPr>
+            <m:t>⋅</m:t>
+          </m:r>
+          <m:r>
+            <m:t>​</m:t>
+          </m:r>
+          <m:d>
+            <m:dPr>
+              <m:begChr m:val="|"/>
+              <m:sepChr m:val=""/>
+              <m:endChr m:val="|"/>
+              <m:grow/>
+            </m:dPr>
+            <m:e>
+              <m:r>
+                <m:t>4</m:t>
+              </m:r>
+              <m:r>
+                <m:rPr>
+                  <m:sty m:val="p"/>
+                </m:rPr>
+                <m:t>−</m:t>
+              </m:r>
+              <m:r>
+                <m:t>1</m:t>
+              </m:r>
+            </m:e>
+          </m:d>
+          <m:r>
+            <m:t>​</m:t>
+          </m:r>
+          <m:r>
+            <m:rPr>
+              <m:sty m:val="p"/>
+            </m:rPr>
+            <m:t>=</m:t>
+          </m:r>
+          <m:r>
+            <m:t>0.5</m:t>
+          </m:r>
+          <m:r>
+            <m:rPr>
+              <m:sty m:val="p"/>
+            </m:rPr>
+            <m:t>⋅</m:t>
+          </m:r>
+          <m:r>
+            <m:t>1</m:t>
+          </m:r>
+          <m:r>
+            <m:rPr>
+              <m:sty m:val="p"/>
+            </m:rPr>
+            <m:t>+</m:t>
+          </m:r>
+          <m:r>
+            <m:t>0.5</m:t>
+          </m:r>
+          <m:r>
+            <m:rPr>
+              <m:sty m:val="p"/>
+            </m:rPr>
+            <m:t>⋅</m:t>
+          </m:r>
+          <m:r>
+            <m:t>3</m:t>
+          </m:r>
+          <m:r>
+            <m:rPr>
+              <m:sty m:val="p"/>
+            </m:rPr>
+            <m:t>=</m:t>
+          </m:r>
+          <m:r>
+            <m:t>2</m:t>
+          </m:r>
+        </m:oMath>
+      </m:oMathPara>
+    </w:p>
+    <w:p>
+      <w:pPr>
+        <w:numPr>
+          <w:ilvl w:val="0"/>
+          <w:numId w:val="1005"/>
+        </w:numPr>
+      </w:pPr>
+      <w:r>
+        <w:t xml:space="preserve">For</w:t>
+      </w:r>
+      <w:r>
+        <w:t xml:space="preserve"> </w:t>
+      </w:r>
+      <m:oMath>
+        <m:r>
+          <m:t>c</m:t>
+        </m:r>
+        <m:r>
+          <m:rPr>
+            <m:sty m:val="p"/>
+          </m:rPr>
+          <m:t>=</m:t>
+        </m:r>
+        <m:r>
+          <m:t>2</m:t>
+        </m:r>
+      </m:oMath>
+      <w:r>
+        <w:t xml:space="preserve">:</w:t>
+      </w:r>
+      <w:r>
+        <w:t xml:space="preserve"> </w:t>
+      </w:r>
+      <w:r>
+        <w:t xml:space="preserve">The expected squared error loss is:</w:t>
+      </w:r>
+    </w:p>
+    <w:p>
+      <w:pPr>
+        <w:pStyle w:val="BodyText"/>
+      </w:pPr>
+      <m:oMathPara>
+        <m:oMathParaPr>
+          <m:jc m:val="center"/>
+        </m:oMathParaPr>
+        <m:oMath>
+          <m:r>
+            <m:rPr>
+              <m:sty m:val="p"/>
+            </m:rPr>
+            <m:t>E</m:t>
+          </m:r>
+          <m:r>
+            <m:t>​</m:t>
+          </m:r>
+          <m:d>
+            <m:dPr>
+              <m:begChr m:val="["/>
+              <m:sepChr m:val=""/>
+              <m:endChr m:val="]"/>
+              <m:grow/>
+            </m:dPr>
+            <m:e>
+              <m:r>
+                <m:t>​</m:t>
+              </m:r>
+              <m:sSup>
+                <m:e>
+                  <m:d>
+                    <m:dPr>
+                      <m:begChr m:val="("/>
+                      <m:sepChr m:val=""/>
+                      <m:endChr m:val=")"/>
+                      <m:grow/>
+                    </m:dPr>
+                    <m:e>
+                      <m:r>
+                        <m:t>Y</m:t>
+                      </m:r>
+                      <m:r>
+                        <m:rPr>
+                          <m:sty m:val="p"/>
+                        </m:rPr>
+                        <m:t>−</m:t>
+                      </m:r>
+                      <m:r>
+                        <m:t>2</m:t>
+                      </m:r>
+                    </m:e>
+                  </m:d>
+                </m:e>
+                <m:sup>
+                  <m:r>
+                    <m:t>2</m:t>
+                  </m:r>
+                </m:sup>
+              </m:sSup>
+              <m:r>
+                <m:t>​</m:t>
+              </m:r>
+            </m:e>
+          </m:d>
+          <m:r>
+            <m:t>​</m:t>
+          </m:r>
+          <m:r>
+            <m:rPr>
+              <m:sty m:val="p"/>
+            </m:rPr>
+            <m:t>=</m:t>
+          </m:r>
+          <m:r>
+            <m:t>0.5</m:t>
+          </m:r>
+          <m:r>
+            <m:rPr>
+              <m:sty m:val="p"/>
+            </m:rPr>
+            <m:t>⋅</m:t>
+          </m:r>
+          <m:r>
+            <m:t>​</m:t>
+          </m:r>
+          <m:sSup>
+            <m:e>
+              <m:d>
+                <m:dPr>
+                  <m:begChr m:val="("/>
+                  <m:sepChr m:val=""/>
+                  <m:endChr m:val=")"/>
+                  <m:grow/>
+                </m:dPr>
+                <m:e>
+                  <m:r>
+                    <m:t>0</m:t>
+                  </m:r>
+                  <m:r>
+                    <m:rPr>
+                      <m:sty m:val="p"/>
+                    </m:rPr>
+                    <m:t>−</m:t>
+                  </m:r>
+                  <m:r>
+                    <m:t>2</m:t>
+                  </m:r>
+                </m:e>
+              </m:d>
+            </m:e>
+            <m:sup>
+              <m:r>
+                <m:t>2</m:t>
+              </m:r>
+            </m:sup>
+          </m:sSup>
+          <m:r>
+            <m:t>​</m:t>
+          </m:r>
+          <m:r>
+            <m:rPr>
+              <m:sty m:val="p"/>
+            </m:rPr>
+            <m:t>+</m:t>
+          </m:r>
+          <m:r>
+            <m:t>0.5</m:t>
+          </m:r>
+          <m:r>
+            <m:rPr>
+              <m:sty m:val="p"/>
+            </m:rPr>
+            <m:t>⋅</m:t>
+          </m:r>
+          <m:r>
+            <m:t>​</m:t>
+          </m:r>
+          <m:sSup>
+            <m:e>
+              <m:d>
+                <m:dPr>
+                  <m:begChr m:val="("/>
+                  <m:sepChr m:val=""/>
+                  <m:endChr m:val=")"/>
+                  <m:grow/>
+                </m:dPr>
+                <m:e>
+                  <m:r>
+                    <m:t>4</m:t>
+                  </m:r>
+                  <m:r>
+                    <m:rPr>
+                      <m:sty m:val="p"/>
+                    </m:rPr>
+                    <m:t>−</m:t>
+                  </m:r>
+                  <m:r>
+                    <m:t>2</m:t>
+                  </m:r>
+                </m:e>
+              </m:d>
+            </m:e>
+            <m:sup>
+              <m:r>
+                <m:t>2</m:t>
+              </m:r>
+            </m:sup>
+          </m:sSup>
+          <m:r>
+            <m:t>​</m:t>
+          </m:r>
+          <m:r>
+            <m:rPr>
+              <m:sty m:val="p"/>
+            </m:rPr>
+            <m:t>=</m:t>
+          </m:r>
+          <m:r>
+            <m:t>0.5</m:t>
+          </m:r>
+          <m:r>
+            <m:rPr>
+              <m:sty m:val="p"/>
+            </m:rPr>
+            <m:t>⋅</m:t>
+          </m:r>
+          <m:r>
+            <m:t>4</m:t>
+          </m:r>
+          <m:r>
+            <m:rPr>
+              <m:sty m:val="p"/>
+            </m:rPr>
+            <m:t>+</m:t>
+          </m:r>
+          <m:r>
+            <m:t>0.5</m:t>
+          </m:r>
+          <m:r>
+            <m:rPr>
+              <m:sty m:val="p"/>
+            </m:rPr>
+            <m:t>⋅</m:t>
+          </m:r>
+          <m:r>
+            <m:t>4</m:t>
+          </m:r>
+          <m:r>
+            <m:rPr>
+              <m:sty m:val="p"/>
+            </m:rPr>
+            <m:t>=</m:t>
+          </m:r>
+          <m:r>
+            <m:t>4</m:t>
+          </m:r>
+        </m:oMath>
+      </m:oMathPara>
+    </w:p>
+    <w:p>
+      <w:pPr>
+        <w:numPr>
+          <w:ilvl w:val="0"/>
+          <w:numId w:val="1000"/>
+        </w:numPr>
+      </w:pPr>
+      <w:r>
+        <w:t xml:space="preserve">The expected absolute error loss is:</w:t>
+      </w:r>
+    </w:p>
+    <w:p>
+      <w:pPr>
+        <w:pStyle w:val="BodyText"/>
+      </w:pPr>
+      <m:oMathPara>
+        <m:oMathParaPr>
+          <m:jc m:val="center"/>
+        </m:oMathParaPr>
+        <m:oMath>
+          <m:r>
+            <m:rPr>
+              <m:sty m:val="p"/>
+            </m:rPr>
+            <m:t>E</m:t>
+          </m:r>
+          <m:r>
+            <m:t>​</m:t>
+          </m:r>
+          <m:d>
+            <m:dPr>
+              <m:begChr m:val="["/>
+              <m:sepChr m:val=""/>
+              <m:endChr m:val="]"/>
+              <m:grow/>
+            </m:dPr>
+            <m:e>
+              <m:r>
+                <m:t>​</m:t>
+              </m:r>
+              <m:d>
+                <m:dPr>
+                  <m:begChr m:val="|"/>
+                  <m:sepChr m:val=""/>
+                  <m:endChr m:val="|"/>
+                  <m:grow/>
+                </m:dPr>
+                <m:e>
+                  <m:r>
+                    <m:t>Y</m:t>
+                  </m:r>
+                  <m:r>
+                    <m:rPr>
+                      <m:sty m:val="p"/>
+                    </m:rPr>
+                    <m:t>−</m:t>
+                  </m:r>
+                  <m:r>
+                    <m:t>2</m:t>
+                  </m:r>
+                </m:e>
+              </m:d>
+              <m:r>
+                <m:t>​</m:t>
+              </m:r>
+            </m:e>
+          </m:d>
+          <m:r>
+            <m:t>​</m:t>
+          </m:r>
+          <m:r>
+            <m:rPr>
+              <m:sty m:val="p"/>
+            </m:rPr>
+            <m:t>=</m:t>
+          </m:r>
+          <m:r>
+            <m:t>0.5</m:t>
+          </m:r>
+          <m:r>
+            <m:rPr>
+              <m:sty m:val="p"/>
+            </m:rPr>
+            <m:t>⋅</m:t>
+          </m:r>
+          <m:r>
+            <m:t>​</m:t>
+          </m:r>
+          <m:d>
+            <m:dPr>
+              <m:begChr m:val="|"/>
+              <m:sepChr m:val=""/>
+              <m:endChr m:val="|"/>
+              <m:grow/>
+            </m:dPr>
+            <m:e>
+              <m:r>
+                <m:t>0</m:t>
+              </m:r>
+              <m:r>
+                <m:rPr>
+                  <m:sty m:val="p"/>
+                </m:rPr>
+                <m:t>−</m:t>
+              </m:r>
+              <m:r>
+                <m:t>2</m:t>
+              </m:r>
+            </m:e>
+          </m:d>
+          <m:r>
+            <m:t>​</m:t>
+          </m:r>
+          <m:r>
+            <m:rPr>
+              <m:sty m:val="p"/>
+            </m:rPr>
+            <m:t>+</m:t>
+          </m:r>
+          <m:r>
+            <m:t>0.5</m:t>
+          </m:r>
+          <m:r>
+            <m:rPr>
+              <m:sty m:val="p"/>
+            </m:rPr>
+            <m:t>⋅</m:t>
+          </m:r>
+          <m:r>
+            <m:t>​</m:t>
+          </m:r>
+          <m:d>
+            <m:dPr>
+              <m:begChr m:val="|"/>
+              <m:sepChr m:val=""/>
+              <m:endChr m:val="|"/>
+              <m:grow/>
+            </m:dPr>
+            <m:e>
+              <m:r>
+                <m:t>4</m:t>
+              </m:r>
+              <m:r>
+                <m:rPr>
+                  <m:sty m:val="p"/>
+                </m:rPr>
+                <m:t>−</m:t>
+              </m:r>
+              <m:r>
+                <m:t>2</m:t>
+              </m:r>
+            </m:e>
+          </m:d>
+          <m:r>
+            <m:t>​</m:t>
+          </m:r>
+          <m:r>
+            <m:rPr>
+              <m:sty m:val="p"/>
+            </m:rPr>
+            <m:t>=</m:t>
+          </m:r>
+          <m:r>
+            <m:t>0.5</m:t>
+          </m:r>
+          <m:r>
+            <m:rPr>
+              <m:sty m:val="p"/>
+            </m:rPr>
+            <m:t>⋅</m:t>
+          </m:r>
+          <m:r>
+            <m:t>2</m:t>
+          </m:r>
+          <m:r>
+            <m:rPr>
+              <m:sty m:val="p"/>
+            </m:rPr>
+            <m:t>+</m:t>
+          </m:r>
+          <m:r>
+            <m:t>0.5</m:t>
+          </m:r>
+          <m:r>
+            <m:rPr>
+              <m:sty m:val="p"/>
+            </m:rPr>
+            <m:t>⋅</m:t>
+          </m:r>
+          <m:r>
+            <m:t>2</m:t>
+          </m:r>
+          <m:r>
+            <m:rPr>
+              <m:sty m:val="p"/>
+            </m:rPr>
+            <m:t>=</m:t>
+          </m:r>
+          <m:r>
+            <m:t>2</m:t>
+          </m:r>
+        </m:oMath>
+      </m:oMathPara>
+    </w:p>
+    <w:p>
+      <w:pPr>
+        <w:numPr>
+          <w:ilvl w:val="0"/>
+          <w:numId w:val="1005"/>
+        </w:numPr>
+      </w:pPr>
+      <w:r>
+        <w:t xml:space="preserve">The prediction</w:t>
+      </w:r>
+      <w:r>
+        <w:t xml:space="preserve"> </w:t>
+      </w:r>
+      <m:oMath>
+        <m:r>
+          <m:t>c</m:t>
+        </m:r>
+        <m:r>
+          <m:rPr>
+            <m:sty m:val="p"/>
+          </m:rPr>
+          <m:t>=</m:t>
+        </m:r>
+        <m:r>
+          <m:t>2</m:t>
+        </m:r>
+      </m:oMath>
+      <w:r>
+        <w:t xml:space="preserve"> </w:t>
+      </w:r>
+      <w:r>
+        <w:t xml:space="preserve">has the smaller expected squared error loss (</w:t>
+      </w:r>
+      <m:oMath>
+        <m:r>
+          <m:t>4</m:t>
+        </m:r>
+      </m:oMath>
+      <w:r>
+        <w:t xml:space="preserve"> </w:t>
+      </w:r>
+      <w:r>
+        <w:t xml:space="preserve">versus</w:t>
+      </w:r>
+      <w:r>
+        <w:t xml:space="preserve"> </w:t>
+      </w:r>
+      <m:oMath>
+        <m:r>
+          <m:t>5</m:t>
+        </m:r>
+      </m:oMath>
+      <w:r>
+        <w:t xml:space="preserve">).</w:t>
+      </w:r>
+      <w:r>
+        <w:t xml:space="preserve"> </w:t>
+      </w:r>
+      <w:r>
+        <w:t xml:space="preserve">The two predictions have the same expected absolute error loss (</w:t>
+      </w:r>
+      <m:oMath>
+        <m:r>
+          <m:t>2</m:t>
+        </m:r>
+      </m:oMath>
+      <w:r>
+        <w:t xml:space="preserve">),</w:t>
+      </w:r>
+      <w:r>
+        <w:t xml:space="preserve"> </w:t>
+      </w:r>
+      <w:r>
+        <w:t xml:space="preserve">so under absolute error loss this exercise does not choose one of them.</w:t>
+      </w:r>
+      <w:r>
+        <w:t xml:space="preserve"> </w:t>
+      </w:r>
+      <w:r>
+        <w:t xml:space="preserve">The prediction</w:t>
+      </w:r>
+      <w:r>
+        <w:t xml:space="preserve"> </w:t>
+      </w:r>
+      <m:oMath>
+        <m:r>
+          <m:t>c</m:t>
+        </m:r>
+        <m:r>
+          <m:rPr>
+            <m:sty m:val="p"/>
+          </m:rPr>
+          <m:t>=</m:t>
+        </m:r>
+        <m:r>
+          <m:t>2</m:t>
+        </m:r>
+      </m:oMath>
+      <w:r>
+        <w:t xml:space="preserve"> </w:t>
+      </w:r>
+      <w:r>
+        <w:t xml:space="preserve">equals the expectation:</w:t>
+      </w:r>
+    </w:p>
+    <w:p>
+      <w:pPr>
+        <w:pStyle w:val="BodyText"/>
+      </w:pPr>
+      <m:oMathPara>
+        <m:oMathParaPr>
+          <m:jc m:val="center"/>
+        </m:oMathParaPr>
+        <m:oMath>
+          <m:r>
+            <m:rPr>
+              <m:sty m:val="p"/>
+            </m:rPr>
+            <m:t>E</m:t>
+          </m:r>
+          <m:r>
+            <m:t>​</m:t>
+          </m:r>
+          <m:d>
+            <m:dPr>
+              <m:begChr m:val="["/>
+              <m:sepChr m:val=""/>
+              <m:endChr m:val="]"/>
+              <m:grow/>
+            </m:dPr>
+            <m:e>
+              <m:r>
+                <m:t>Y</m:t>
+              </m:r>
+            </m:e>
+          </m:d>
+          <m:r>
+            <m:t>​</m:t>
+          </m:r>
+          <m:r>
+            <m:rPr>
+              <m:sty m:val="p"/>
+            </m:rPr>
+            <m:t>=</m:t>
+          </m:r>
+          <m:r>
+            <m:t>0.5</m:t>
+          </m:r>
+          <m:r>
+            <m:rPr>
+              <m:sty m:val="p"/>
+            </m:rPr>
+            <m:t>⋅</m:t>
+          </m:r>
+          <m:r>
+            <m:t>0</m:t>
+          </m:r>
+          <m:r>
+            <m:rPr>
+              <m:sty m:val="p"/>
+            </m:rPr>
+            <m:t>+</m:t>
+          </m:r>
+          <m:r>
+            <m:t>0.5</m:t>
+          </m:r>
+          <m:r>
+            <m:rPr>
+              <m:sty m:val="p"/>
+            </m:rPr>
+            <m:t>⋅</m:t>
+          </m:r>
+          <m:r>
+            <m:t>4</m:t>
+          </m:r>
+          <m:r>
+            <m:rPr>
+              <m:sty m:val="p"/>
+            </m:rPr>
+            <m:t>=</m:t>
+          </m:r>
+          <m:r>
+            <m:t>2</m:t>
+          </m:r>
+        </m:oMath>
+      </m:oMathPara>
+    </w:p>
+    <w:bookmarkEnd w:id="89"/>
+    <w:bookmarkStart w:id="90" w:name="def-loss-function"/>
+    <w:p>
+      <w:pPr>
+        <w:pStyle w:val="FirstParagraph"/>
+      </w:pPr>
+      <w:r>
+        <w:rPr>
+          <w:b/>
+          <w:bCs/>
+        </w:rPr>
+        <w:t xml:space="preserve">Definition 9 (Loss function)</w:t>
+      </w:r>
+      <w:r>
+        <w:t xml:space="preserve"> </w:t>
+      </w:r>
+      <w:r>
+        <w:t xml:space="preserve">A</w:t>
+      </w:r>
+      <w:r>
+        <w:t xml:space="preserve"> </w:t>
+      </w:r>
+      <w:r>
+        <w:rPr>
+          <w:b/>
+          <w:bCs/>
+        </w:rPr>
+        <w:t xml:space="preserve">loss function</w:t>
+      </w:r>
+      <w:r>
+        <w:t xml:space="preserve"> </w:t>
+      </w:r>
+      <m:oMath>
+        <m:r>
+          <m:t>L</m:t>
+        </m:r>
+        <m:r>
+          <m:rPr>
+            <m:sty m:val="p"/>
+          </m:rPr>
+          <m:t>(</m:t>
+        </m:r>
+        <m:r>
+          <m:t>y</m:t>
+        </m:r>
+        <m:r>
+          <m:rPr>
+            <m:sty m:val="p"/>
+          </m:rPr>
+          <m:t>,</m:t>
+        </m:r>
+        <m:acc>
+          <m:accPr>
+            <m:chr m:val="̂"/>
+          </m:accPr>
+          <m:e>
+            <m:r>
+              <m:t>y</m:t>
+            </m:r>
+          </m:e>
+        </m:acc>
+        <m:r>
+          <m:rPr>
+            <m:sty m:val="p"/>
+          </m:rPr>
+          <m:t>)</m:t>
+        </m:r>
+      </m:oMath>
+      <w:r>
+        <w:t xml:space="preserve"> </w:t>
+      </w:r>
+      <w:r>
+        <w:t xml:space="preserve">is a rule that gives a number that is 0 or larger:</w:t>
+      </w:r>
+      <w:r>
+        <w:t xml:space="preserve"> </w:t>
+      </w:r>
+      <w:r>
+        <w:t xml:space="preserve">the cost of predicting</w:t>
+      </w:r>
+      <w:r>
+        <w:t xml:space="preserve"> </w:t>
+      </w:r>
+      <m:oMath>
+        <m:acc>
+          <m:accPr>
+            <m:chr m:val="̂"/>
+          </m:accPr>
+          <m:e>
+            <m:r>
+              <m:t>y</m:t>
+            </m:r>
+          </m:e>
+        </m:acc>
+      </m:oMath>
+      <w:r>
+        <w:t xml:space="preserve"> </w:t>
+      </w:r>
+      <w:r>
+        <w:t xml:space="preserve">when the true value is</w:t>
+      </w:r>
+      <w:r>
+        <w:t xml:space="preserve"> </w:t>
+      </w:r>
+      <m:oMath>
+        <m:r>
+          <m:t>y</m:t>
+        </m:r>
+      </m:oMath>
+      <w:r>
+        <w:t xml:space="preserve">.</w:t>
+      </w:r>
+    </w:p>
+    <w:bookmarkEnd w:id="90"/>
+    <w:p>
+      <w:pPr>
+        <w:pStyle w:val="BodyText"/>
+      </w:pPr>
+      <w:r>
+        <w:rPr>
+          <w:i/>
+          <w:iCs/>
+        </w:rPr>
+        <w:t xml:space="preserve">Remark</w:t>
+      </w:r>
+      <w:r>
+        <w:t xml:space="preserve">. </w:t>
+      </w:r>
+      <w:r>
+        <w:t xml:space="preserve">The squared error loss is:</w:t>
+      </w:r>
+    </w:p>
+    <w:p>
+      <w:pPr>
+        <w:pStyle w:val="BodyText"/>
+      </w:pPr>
+      <m:oMathPara>
+        <m:oMathParaPr>
+          <m:jc m:val="center"/>
+        </m:oMathParaPr>
+        <m:oMath>
+          <m:r>
+            <m:t>L</m:t>
+          </m:r>
+          <m:r>
+            <m:rPr>
+              <m:sty m:val="p"/>
+            </m:rPr>
+            <m:t>(</m:t>
+          </m:r>
+          <m:r>
+            <m:t>y</m:t>
+          </m:r>
+          <m:r>
+            <m:rPr>
+              <m:sty m:val="p"/>
+            </m:rPr>
+            <m:t>,</m:t>
+          </m:r>
+          <m:acc>
+            <m:accPr>
+              <m:chr m:val="̂"/>
+            </m:accPr>
+            <m:e>
+              <m:r>
+                <m:t>y</m:t>
+              </m:r>
+            </m:e>
+          </m:acc>
+          <m:r>
+            <m:rPr>
+              <m:sty m:val="p"/>
+            </m:rPr>
+            <m:t>)</m:t>
+          </m:r>
+          <m:r>
+            <m:rPr>
+              <m:sty m:val="p"/>
+            </m:rPr>
+            <m:t>=</m:t>
+          </m:r>
+          <m:r>
+            <m:t>​</m:t>
+          </m:r>
+          <m:sSup>
+            <m:e>
+              <m:d>
+                <m:dPr>
+                  <m:begChr m:val="("/>
+                  <m:sepChr m:val=""/>
+                  <m:endChr m:val=")"/>
+                  <m:grow/>
+                </m:dPr>
+                <m:e>
+                  <m:r>
+                    <m:t>y</m:t>
+                  </m:r>
+                  <m:r>
+                    <m:rPr>
+                      <m:sty m:val="p"/>
+                    </m:rPr>
+                    <m:t>−</m:t>
+                  </m:r>
+                  <m:acc>
+                    <m:accPr>
+                      <m:chr m:val="̂"/>
+                    </m:accPr>
+                    <m:e>
+                      <m:r>
+                        <m:t>y</m:t>
+                      </m:r>
+                    </m:e>
+                  </m:acc>
+                </m:e>
+              </m:d>
+            </m:e>
+            <m:sup>
+              <m:r>
+                <m:t>2</m:t>
+              </m:r>
+            </m:sup>
+          </m:sSup>
+          <m:r>
+            <m:t>​</m:t>
+          </m:r>
+        </m:oMath>
+      </m:oMathPara>
+    </w:p>
+    <w:p>
+      <w:pPr>
+        <w:pStyle w:val="FirstParagraph"/>
+      </w:pPr>
+      <w:r>
+        <w:t xml:space="preserve">The absolute error loss is:</w:t>
+      </w:r>
+    </w:p>
+    <w:p>
+      <w:pPr>
+        <w:pStyle w:val="BodyText"/>
+      </w:pPr>
+      <m:oMathPara>
+        <m:oMathParaPr>
+          <m:jc m:val="center"/>
+        </m:oMathParaPr>
+        <m:oMath>
+          <m:r>
+            <m:t>L</m:t>
+          </m:r>
+          <m:r>
+            <m:rPr>
+              <m:sty m:val="p"/>
+            </m:rPr>
+            <m:t>(</m:t>
+          </m:r>
+          <m:r>
+            <m:t>y</m:t>
+          </m:r>
+          <m:r>
+            <m:rPr>
+              <m:sty m:val="p"/>
+            </m:rPr>
+            <m:t>,</m:t>
+          </m:r>
+          <m:acc>
+            <m:accPr>
+              <m:chr m:val="̂"/>
+            </m:accPr>
+            <m:e>
+              <m:r>
+                <m:t>y</m:t>
+              </m:r>
+            </m:e>
+          </m:acc>
+          <m:r>
+            <m:rPr>
+              <m:sty m:val="p"/>
+            </m:rPr>
+            <m:t>)</m:t>
+          </m:r>
+          <m:r>
+            <m:rPr>
+              <m:sty m:val="p"/>
+            </m:rPr>
+            <m:t>=</m:t>
+          </m:r>
+          <m:r>
+            <m:t>​</m:t>
+          </m:r>
+          <m:d>
+            <m:dPr>
+              <m:begChr m:val="|"/>
+              <m:sepChr m:val=""/>
+              <m:endChr m:val="|"/>
+              <m:grow/>
+            </m:dPr>
+            <m:e>
+              <m:r>
+                <m:t>y</m:t>
+              </m:r>
+              <m:r>
+                <m:rPr>
+                  <m:sty m:val="p"/>
+                </m:rPr>
+                <m:t>−</m:t>
+              </m:r>
+              <m:acc>
+                <m:accPr>
+                  <m:chr m:val="̂"/>
+                </m:accPr>
+                <m:e>
+                  <m:r>
+                    <m:t>y</m:t>
+                  </m:r>
+                </m:e>
+              </m:acc>
+            </m:e>
+          </m:d>
+          <m:r>
+            <m:t>​</m:t>
+          </m:r>
+        </m:oMath>
+      </m:oMathPara>
+    </w:p>
+    <w:p>
+      <w:pPr>
+        <w:pStyle w:val="FirstParagraph"/>
+      </w:pPr>
+      <w:r>
+        <w:t xml:space="preserve">Hastie et al. (2009, 18)</w:t>
+      </w:r>
+      <w:r>
+        <w:t xml:space="preserve"> </w:t>
+      </w:r>
+      <w:r>
+        <w:t xml:space="preserve">call squared error loss</w:t>
+      </w:r>
+      <w:r>
+        <w:t xml:space="preserve"> </w:t>
+      </w:r>
+      <w:r>
+        <w:t xml:space="preserve">“by far the most common and convenient”</w:t>
+      </w:r>
+      <w:r>
+        <w:t xml:space="preserve"> </w:t>
+      </w:r>
+      <w:r>
+        <w:t xml:space="preserve">choice.</w:t>
+      </w:r>
+    </w:p>
+    <w:p>
+      <w:pPr>
+        <w:pStyle w:val="BodyText"/>
+      </w:pPr>
+      <w:r>
+        <w:t xml:space="preserve">For the values</w:t>
+      </w:r>
+      <w:r>
+        <w:t xml:space="preserve"> </w:t>
+      </w:r>
+      <m:oMath>
+        <m:r>
+          <m:t>y</m:t>
+        </m:r>
+        <m:r>
+          <m:rPr>
+            <m:sty m:val="p"/>
+          </m:rPr>
+          <m:t>=</m:t>
+        </m:r>
+        <m:r>
+          <m:t>3</m:t>
+        </m:r>
+      </m:oMath>
+      <w:r>
+        <w:t xml:space="preserve"> </w:t>
+      </w:r>
+      <w:r>
+        <w:t xml:space="preserve">and</w:t>
+      </w:r>
+      <w:r>
+        <w:t xml:space="preserve"> </w:t>
+      </w:r>
+      <m:oMath>
+        <m:acc>
+          <m:accPr>
+            <m:chr m:val="̂"/>
+          </m:accPr>
+          <m:e>
+            <m:r>
+              <m:t>y</m:t>
+            </m:r>
+          </m:e>
+        </m:acc>
+        <m:r>
+          <m:rPr>
+            <m:sty m:val="p"/>
+          </m:rPr>
+          <m:t>=</m:t>
+        </m:r>
+        <m:r>
+          <m:t>5</m:t>
+        </m:r>
+      </m:oMath>
+      <w:r>
+        <w:t xml:space="preserve"> </w:t>
+      </w:r>
+      <w:r>
+        <w:t xml:space="preserve">from</w:t>
+      </w:r>
+      <w:r>
+        <w:t xml:space="preserve"> </w:t>
+      </w:r>
+      <w:hyperlink w:anchor="exr-loss">
+        <w:r>
+          <w:rPr>
+            <w:rStyle w:val="Hyperlink"/>
+          </w:rPr>
+          <w:t xml:space="preserve">Exercise 6</w:t>
+        </w:r>
+      </w:hyperlink>
+      <w:r>
+        <w:t xml:space="preserve"> </w:t>
+      </w:r>
+      <w:r>
+        <w:t xml:space="preserve">(part 1),</w:t>
+      </w:r>
+      <w:r>
+        <w:t xml:space="preserve"> </w:t>
+      </w:r>
+      <w:r>
+        <w:t xml:space="preserve">the squared error loss is</w:t>
+      </w:r>
+      <w:r>
+        <w:t xml:space="preserve"> </w:t>
+      </w:r>
+      <m:oMath>
+        <m:r>
+          <m:t>4</m:t>
+        </m:r>
+      </m:oMath>
+      <w:r>
+        <w:t xml:space="preserve">,</w:t>
+      </w:r>
+      <w:r>
+        <w:t xml:space="preserve"> </w:t>
+      </w:r>
+      <w:r>
+        <w:t xml:space="preserve">and the absolute error loss is</w:t>
+      </w:r>
+      <w:r>
+        <w:t xml:space="preserve"> </w:t>
+      </w:r>
+      <m:oMath>
+        <m:r>
+          <m:t>2</m:t>
+        </m:r>
+      </m:oMath>
+      <w:r>
+        <w:t xml:space="preserve">.</w:t>
+      </w:r>
+    </w:p>
+    <w:bookmarkStart w:id="91" w:name="def-risk"/>
+    <w:p>
+      <w:pPr>
+        <w:pStyle w:val="BodyText"/>
+      </w:pPr>
+      <w:r>
+        <w:rPr>
+          <w:b/>
+          <w:bCs/>
+        </w:rPr>
+        <w:t xml:space="preserve">Definition 10 (Risk (expected loss))</w:t>
+      </w:r>
+      <w:r>
+        <w:t xml:space="preserve"> </w:t>
+      </w:r>
+      <w:r>
+        <w:t xml:space="preserve">For a random variable</w:t>
+      </w:r>
+      <w:r>
+        <w:t xml:space="preserve"> </w:t>
+      </w:r>
+      <m:oMath>
+        <m:r>
+          <m:t>Y</m:t>
+        </m:r>
+      </m:oMath>
+      <w:r>
+        <w:t xml:space="preserve"> </w:t>
+      </w:r>
+      <w:r>
+        <w:t xml:space="preserve">and a prediction</w:t>
+      </w:r>
+      <w:r>
+        <w:t xml:space="preserve"> </w:t>
+      </w:r>
+      <m:oMath>
+        <m:acc>
+          <m:accPr>
+            <m:chr m:val="̂"/>
+          </m:accPr>
+          <m:e>
+            <m:r>
+              <m:t>y</m:t>
+            </m:r>
+          </m:e>
+        </m:acc>
+      </m:oMath>
+      <w:r>
+        <w:t xml:space="preserve"> </w:t>
+      </w:r>
+      <w:r>
+        <w:t xml:space="preserve">(a constant, or a function</w:t>
+      </w:r>
+      <w:r>
+        <w:t xml:space="preserve"> </w:t>
+      </w:r>
+      <m:oMath>
+        <m:r>
+          <m:t>f</m:t>
+        </m:r>
+        <m:r>
+          <m:rPr>
+            <m:sty m:val="p"/>
+          </m:rPr>
+          <m:t>(</m:t>
+        </m:r>
+        <m:r>
+          <m:t>X</m:t>
+        </m:r>
+        <m:r>
+          <m:rPr>
+            <m:sty m:val="p"/>
+          </m:rPr>
+          <m:t>)</m:t>
+        </m:r>
+      </m:oMath>
+      <w:r>
+        <w:t xml:space="preserve"> </w:t>
+      </w:r>
+      <w:r>
+        <w:t xml:space="preserve">of a random input</w:t>
+      </w:r>
+      <w:r>
+        <w:t xml:space="preserve"> </w:t>
+      </w:r>
+      <m:oMath>
+        <m:r>
+          <m:t>X</m:t>
+        </m:r>
+      </m:oMath>
+      <w:r>
+        <w:t xml:space="preserve">),</w:t>
+      </w:r>
+      <w:r>
+        <w:t xml:space="preserve"> </w:t>
+      </w:r>
+      <w:r>
+        <w:t xml:space="preserve">the</w:t>
+      </w:r>
+      <w:r>
+        <w:t xml:space="preserve"> </w:t>
+      </w:r>
+      <w:r>
+        <w:rPr>
+          <w:b/>
+          <w:bCs/>
+        </w:rPr>
+        <w:t xml:space="preserve">risk</w:t>
+      </w:r>
+      <w:r>
+        <w:t xml:space="preserve"> </w:t>
+      </w:r>
+      <w:r>
+        <w:t xml:space="preserve">is the expectation of the</w:t>
+      </w:r>
+      <w:r>
+        <w:t xml:space="preserve"> </w:t>
+      </w:r>
+      <w:hyperlink w:anchor="def-loss-function">
+        <w:r>
+          <w:rPr>
+            <w:rStyle w:val="Hyperlink"/>
+          </w:rPr>
+          <w:t xml:space="preserve">loss</w:t>
+        </w:r>
+      </w:hyperlink>
+      <w:r>
+        <w:t xml:space="preserve">:</w:t>
+      </w:r>
+    </w:p>
+    <w:p>
+      <w:pPr>
+        <w:pStyle w:val="BodyText"/>
+      </w:pPr>
+      <m:oMathPara>
+        <m:oMathParaPr>
+          <m:jc m:val="center"/>
+        </m:oMathParaPr>
+        <m:oMath>
+          <m:r>
+            <m:t>R</m:t>
+          </m:r>
+          <m:limUpp>
+            <m:e>
+              <m:r>
+                <m:rPr>
+                  <m:sty m:val="p"/>
+                </m:rPr>
+                <m:t>=</m:t>
+              </m:r>
+            </m:e>
+            <m:lim>
+              <m:r>
+                <m:rPr>
+                  <m:nor/>
+                  <m:sty m:val="p"/>
+                </m:rPr>
+                <m:t>def</m:t>
+              </m:r>
+            </m:lim>
+          </m:limUpp>
+          <m:r>
+            <m:rPr>
+              <m:sty m:val="p"/>
+            </m:rPr>
+            <m:t>E</m:t>
+          </m:r>
+          <m:r>
+            <m:t>​</m:t>
+          </m:r>
+          <m:d>
+            <m:dPr>
+              <m:begChr m:val="["/>
+              <m:sepChr m:val=""/>
+              <m:endChr m:val="]"/>
+              <m:grow/>
+            </m:dPr>
+            <m:e>
+              <m:r>
+                <m:t>L</m:t>
+              </m:r>
+              <m:r>
+                <m:rPr>
+                  <m:sty m:val="p"/>
+                </m:rPr>
+                <m:t>(</m:t>
+              </m:r>
+              <m:r>
+                <m:t>Y</m:t>
+              </m:r>
+              <m:r>
+                <m:rPr>
+                  <m:sty m:val="p"/>
+                </m:rPr>
+                <m:t>,</m:t>
+              </m:r>
+              <m:acc>
+                <m:accPr>
+                  <m:chr m:val="̂"/>
+                </m:accPr>
+                <m:e>
+                  <m:r>
+                    <m:t>y</m:t>
+                  </m:r>
+                </m:e>
+              </m:acc>
+              <m:r>
+                <m:rPr>
+                  <m:sty m:val="p"/>
+                </m:rPr>
+                <m:t>)</m:t>
+              </m:r>
+            </m:e>
+          </m:d>
+          <m:r>
+            <m:t>​</m:t>
+          </m:r>
+        </m:oMath>
+      </m:oMathPara>
+    </w:p>
+    <w:bookmarkEnd w:id="91"/>
+    <w:p>
+      <w:pPr>
+        <w:pStyle w:val="FirstParagraph"/>
+      </w:pPr>
+      <w:r>
+        <w:rPr>
+          <w:i/>
+          <w:iCs/>
+        </w:rPr>
+        <w:t xml:space="preserve">Remark</w:t>
+      </w:r>
+      <w:r>
+        <w:t xml:space="preserve">. </w:t>
+      </w:r>
+      <w:r>
+        <w:t xml:space="preserve">In</w:t>
+      </w:r>
+      <w:r>
+        <w:t xml:space="preserve"> </w:t>
+      </w:r>
+      <w:hyperlink w:anchor="exr-loss">
+        <w:r>
+          <w:rPr>
+            <w:rStyle w:val="Hyperlink"/>
+          </w:rPr>
+          <w:t xml:space="preserve">Exercise 6</w:t>
+        </w:r>
+      </w:hyperlink>
+      <w:r>
+        <w:t xml:space="preserve"> </w:t>
+      </w:r>
+      <w:r>
+        <w:t xml:space="preserve">(parts 2 and 3),</w:t>
+      </w:r>
+      <w:r>
+        <w:t xml:space="preserve"> </w:t>
+      </w:r>
+      <w:r>
+        <w:t xml:space="preserve">the risk of the prediction</w:t>
+      </w:r>
+      <w:r>
+        <w:t xml:space="preserve"> </w:t>
+      </w:r>
+      <m:oMath>
+        <m:r>
+          <m:t>c</m:t>
+        </m:r>
+        <m:r>
+          <m:rPr>
+            <m:sty m:val="p"/>
+          </m:rPr>
+          <m:t>=</m:t>
+        </m:r>
+        <m:r>
+          <m:t>1</m:t>
+        </m:r>
+      </m:oMath>
+      <w:r>
+        <w:t xml:space="preserve"> </w:t>
+      </w:r>
+      <w:r>
+        <w:t xml:space="preserve">is</w:t>
+      </w:r>
+      <w:r>
+        <w:t xml:space="preserve"> </w:t>
+      </w:r>
+      <m:oMath>
+        <m:r>
+          <m:t>5</m:t>
+        </m:r>
+      </m:oMath>
+      <w:r>
+        <w:t xml:space="preserve"> </w:t>
+      </w:r>
+      <w:r>
+        <w:t xml:space="preserve">for squared error loss and</w:t>
+      </w:r>
+      <w:r>
+        <w:t xml:space="preserve"> </w:t>
+      </w:r>
+      <m:oMath>
+        <m:r>
+          <m:t>2</m:t>
+        </m:r>
+      </m:oMath>
+      <w:r>
+        <w:t xml:space="preserve"> </w:t>
+      </w:r>
+      <w:r>
+        <w:t xml:space="preserve">for absolute error loss.</w:t>
+      </w:r>
+      <w:r>
+        <w:t xml:space="preserve"> </w:t>
+      </w:r>
+      <w:r>
+        <w:t xml:space="preserve">The risk of the prediction</w:t>
+      </w:r>
+      <w:r>
+        <w:t xml:space="preserve"> </w:t>
+      </w:r>
+      <m:oMath>
+        <m:r>
+          <m:t>c</m:t>
+        </m:r>
+        <m:r>
+          <m:rPr>
+            <m:sty m:val="p"/>
+          </m:rPr>
+          <m:t>=</m:t>
+        </m:r>
+        <m:r>
+          <m:t>2</m:t>
+        </m:r>
+      </m:oMath>
+      <w:r>
+        <w:t xml:space="preserve"> </w:t>
+      </w:r>
+      <w:r>
+        <w:t xml:space="preserve">is</w:t>
+      </w:r>
+      <w:r>
+        <w:t xml:space="preserve"> </w:t>
+      </w:r>
+      <m:oMath>
+        <m:r>
+          <m:t>4</m:t>
+        </m:r>
+      </m:oMath>
+      <w:r>
+        <w:t xml:space="preserve"> </w:t>
+      </w:r>
+      <w:r>
+        <w:t xml:space="preserve">for squared error loss and</w:t>
+      </w:r>
+      <w:r>
+        <w:t xml:space="preserve"> </w:t>
+      </w:r>
+      <m:oMath>
+        <m:r>
+          <m:t>2</m:t>
+        </m:r>
+      </m:oMath>
+      <w:r>
+        <w:t xml:space="preserve"> </w:t>
+      </w:r>
+      <w:r>
+        <w:t xml:space="preserve">for absolute error loss.</w:t>
+      </w:r>
+    </w:p>
+    <w:p>
+      <w:pPr>
+        <w:pStyle w:val="BodyText"/>
+      </w:pPr>
+      <w:r>
+        <w:t xml:space="preserve">For squared error loss and a prediction</w:t>
+      </w:r>
+      <w:r>
+        <w:t xml:space="preserve"> </w:t>
+      </w:r>
+      <m:oMath>
+        <m:r>
+          <m:t>f</m:t>
+        </m:r>
+        <m:r>
+          <m:rPr>
+            <m:sty m:val="p"/>
+          </m:rPr>
+          <m:t>(</m:t>
+        </m:r>
+        <m:r>
+          <m:t>X</m:t>
+        </m:r>
+        <m:r>
+          <m:rPr>
+            <m:sty m:val="p"/>
+          </m:rPr>
+          <m:t>)</m:t>
+        </m:r>
+      </m:oMath>
+      <w:r>
+        <w:t xml:space="preserve">,</w:t>
+      </w:r>
+      <w:r>
+        <w:t xml:space="preserve"> </w:t>
+      </w:r>
+      <w:r>
+        <w:t xml:space="preserve">the risk is</w:t>
+      </w:r>
+      <w:r>
+        <w:t xml:space="preserve"> </w:t>
+      </w:r>
+      <m:oMath>
+        <m:r>
+          <m:rPr>
+            <m:sty m:val="p"/>
+          </m:rPr>
+          <m:t>E</m:t>
+        </m:r>
+        <m:r>
+          <m:t>​</m:t>
+        </m:r>
+        <m:d>
+          <m:dPr>
+            <m:begChr m:val="["/>
+            <m:sepChr m:val=""/>
+            <m:endChr m:val="]"/>
+            <m:grow/>
+          </m:dPr>
+          <m:e>
+            <m:r>
+              <m:t>​</m:t>
+            </m:r>
+            <m:sSup>
+              <m:e>
+                <m:d>
+                  <m:dPr>
+                    <m:begChr m:val="("/>
+                    <m:sepChr m:val=""/>
+                    <m:endChr m:val=")"/>
+                    <m:grow/>
+                  </m:dPr>
+                  <m:e>
+                    <m:r>
+                      <m:t>Y</m:t>
+                    </m:r>
+                    <m:r>
+                      <m:rPr>
+                        <m:sty m:val="p"/>
+                      </m:rPr>
+                      <m:t>−</m:t>
+                    </m:r>
+                    <m:r>
+                      <m:t>f</m:t>
+                    </m:r>
+                    <m:r>
+                      <m:rPr>
+                        <m:sty m:val="p"/>
+                      </m:rPr>
+                      <m:t>(</m:t>
+                    </m:r>
+                    <m:r>
+                      <m:t>X</m:t>
+                    </m:r>
+                    <m:r>
+                      <m:rPr>
+                        <m:sty m:val="p"/>
+                      </m:rPr>
+                      <m:t>)</m:t>
+                    </m:r>
+                  </m:e>
+                </m:d>
+              </m:e>
+              <m:sup>
+                <m:r>
+                  <m:t>2</m:t>
+                </m:r>
+              </m:sup>
+            </m:sSup>
+            <m:r>
+              <m:t>​</m:t>
+            </m:r>
+          </m:e>
+        </m:d>
+        <m:r>
+          <m:t>​</m:t>
+        </m:r>
+      </m:oMath>
+      <w:r>
+        <w:t xml:space="preserve">.</w:t>
+      </w:r>
+      <w:r>
+        <w:t xml:space="preserve"> </w:t>
+      </w:r>
+      <w:r>
+        <w:t xml:space="preserve">Hastie et al. (2009, 18)</w:t>
+      </w:r>
+      <w:r>
+        <w:t xml:space="preserve"> </w:t>
+      </w:r>
+      <w:r>
+        <w:t xml:space="preserve">call it the expected prediction error.</w:t>
+      </w:r>
+    </w:p>
+    <w:p>
+      <w:pPr>
+        <w:pStyle w:val="BodyText"/>
+      </w:pPr>
+      <w:r>
+        <w:t xml:space="preserve">The prediction with the smallest risk depends on the loss.</w:t>
+      </w:r>
+      <w:r>
+        <w:t xml:space="preserve"> </w:t>
+      </w:r>
+      <w:r>
+        <w:t xml:space="preserve">In</w:t>
+      </w:r>
+      <w:r>
+        <w:t xml:space="preserve"> </w:t>
+      </w:r>
+      <w:hyperlink w:anchor="exr-loss">
+        <w:r>
+          <w:rPr>
+            <w:rStyle w:val="Hyperlink"/>
+          </w:rPr>
+          <w:t xml:space="preserve">Exercise 6</w:t>
+        </w:r>
+      </w:hyperlink>
+      <w:r>
+        <w:t xml:space="preserve">, every constant</w:t>
+      </w:r>
+      <w:r>
+        <w:t xml:space="preserve"> </w:t>
+      </w:r>
+      <m:oMath>
+        <m:r>
+          <m:t>c</m:t>
+        </m:r>
+      </m:oMath>
+      <w:r>
+        <w:t xml:space="preserve"> </w:t>
+      </w:r>
+      <w:r>
+        <w:t xml:space="preserve">from</w:t>
+      </w:r>
+      <w:r>
+        <w:t xml:space="preserve"> </w:t>
+      </w:r>
+      <m:oMath>
+        <m:r>
+          <m:t>0</m:t>
+        </m:r>
+      </m:oMath>
+      <w:r>
+        <w:t xml:space="preserve"> </w:t>
+      </w:r>
+      <w:r>
+        <w:t xml:space="preserve">to</w:t>
+      </w:r>
+      <w:r>
+        <w:t xml:space="preserve"> </w:t>
+      </w:r>
+      <m:oMath>
+        <m:r>
+          <m:t>4</m:t>
+        </m:r>
+      </m:oMath>
+      <w:r>
+        <w:t xml:space="preserve"> </w:t>
+      </w:r>
+      <w:r>
+        <w:t xml:space="preserve">has absolute error risk</w:t>
+      </w:r>
+      <w:r>
+        <w:t xml:space="preserve"> </w:t>
+      </w:r>
+      <m:oMath>
+        <m:r>
+          <m:t>2</m:t>
+        </m:r>
+      </m:oMath>
+      <w:r>
+        <w:t xml:space="preserve">,</w:t>
+      </w:r>
+      <w:r>
+        <w:t xml:space="preserve"> </w:t>
+      </w:r>
+      <w:r>
+        <w:t xml:space="preserve">because</w:t>
+      </w:r>
+      <w:r>
+        <w:t xml:space="preserve"> </w:t>
+      </w:r>
+      <m:oMath>
+        <m:r>
+          <m:rPr>
+            <m:sty m:val="p"/>
+          </m:rPr>
+          <m:t>E</m:t>
+        </m:r>
+        <m:r>
+          <m:t>​</m:t>
+        </m:r>
+        <m:d>
+          <m:dPr>
+            <m:begChr m:val="["/>
+            <m:sepChr m:val=""/>
+            <m:endChr m:val="]"/>
+            <m:grow/>
+          </m:dPr>
+          <m:e>
+            <m:r>
+              <m:t>​</m:t>
+            </m:r>
+            <m:d>
+              <m:dPr>
+                <m:begChr m:val="|"/>
+                <m:sepChr m:val=""/>
+                <m:endChr m:val="|"/>
+                <m:grow/>
+              </m:dPr>
+              <m:e>
+                <m:r>
+                  <m:t>Y</m:t>
+                </m:r>
+                <m:r>
+                  <m:rPr>
+                    <m:sty m:val="p"/>
+                  </m:rPr>
+                  <m:t>−</m:t>
+                </m:r>
+                <m:r>
+                  <m:t>c</m:t>
+                </m:r>
+              </m:e>
+            </m:d>
+            <m:r>
+              <m:t>​</m:t>
+            </m:r>
+          </m:e>
+        </m:d>
+        <m:r>
+          <m:t>​</m:t>
+        </m:r>
+        <m:r>
+          <m:rPr>
+            <m:sty m:val="p"/>
+          </m:rPr>
+          <m:t>=</m:t>
+        </m:r>
+        <m:r>
+          <m:t>0.5</m:t>
+        </m:r>
+        <m:r>
+          <m:t> </m:t>
+        </m:r>
+        <m:r>
+          <m:t>c</m:t>
+        </m:r>
+        <m:r>
+          <m:rPr>
+            <m:sty m:val="p"/>
+          </m:rPr>
+          <m:t>+</m:t>
+        </m:r>
+        <m:r>
+          <m:t>0.5</m:t>
+        </m:r>
+        <m:r>
+          <m:t> </m:t>
+        </m:r>
+        <m:r>
+          <m:rPr>
+            <m:sty m:val="p"/>
+          </m:rPr>
+          <m:t>(</m:t>
+        </m:r>
+        <m:r>
+          <m:t>4</m:t>
+        </m:r>
+        <m:r>
+          <m:rPr>
+            <m:sty m:val="p"/>
+          </m:rPr>
+          <m:t>−</m:t>
+        </m:r>
+        <m:r>
+          <m:t>c</m:t>
+        </m:r>
+        <m:r>
+          <m:rPr>
+            <m:sty m:val="p"/>
+          </m:rPr>
+          <m:t>)</m:t>
+        </m:r>
+        <m:r>
+          <m:rPr>
+            <m:sty m:val="p"/>
+          </m:rPr>
+          <m:t>=</m:t>
+        </m:r>
+        <m:r>
+          <m:t>2</m:t>
+        </m:r>
+      </m:oMath>
+      <w:r>
+        <w:t xml:space="preserve">.</w:t>
+      </w:r>
+      <w:r>
+        <w:t xml:space="preserve"> </w:t>
+      </w:r>
+      <w:r>
+        <w:t xml:space="preserve">Only</w:t>
+      </w:r>
+      <w:r>
+        <w:t xml:space="preserve"> </w:t>
+      </w:r>
+      <m:oMath>
+        <m:r>
+          <m:t>c</m:t>
+        </m:r>
+        <m:r>
+          <m:rPr>
+            <m:sty m:val="p"/>
+          </m:rPr>
+          <m:t>=</m:t>
+        </m:r>
+        <m:r>
+          <m:t>2</m:t>
+        </m:r>
+      </m:oMath>
+      <w:r>
+        <w:t xml:space="preserve"> </w:t>
+      </w:r>
+      <w:r>
+        <w:t xml:space="preserve">has the smallest squared error risk.</w:t>
+      </w:r>
+      <w:r>
+        <w:t xml:space="preserve"> </w:t>
+      </w:r>
+      <w:r>
+        <w:t xml:space="preserve">Hastie et al. (2009, 20)</w:t>
+      </w:r>
+      <w:r>
+        <w:t xml:space="preserve"> </w:t>
+      </w:r>
+      <w:r>
+        <w:t xml:space="preserve">state that, for absolute error loss,</w:t>
+      </w:r>
+      <w:r>
+        <w:t xml:space="preserve"> </w:t>
+      </w:r>
+      <w:r>
+        <w:t xml:space="preserve">the best prediction function is the conditional median</w:t>
+      </w:r>
+      <w:r>
+        <w:t xml:space="preserve"> </w:t>
+      </w:r>
+      <w:r>
+        <w:t xml:space="preserve">instead of the conditional mean.</w:t>
+      </w:r>
+      <w:r>
+        <w:t xml:space="preserve"> </w:t>
+      </w:r>
+      <w:r>
+        <w:t xml:space="preserve">This statement is given here without proof.</w:t>
+      </w:r>
+    </w:p>
+    <w:bookmarkEnd w:id="92"/>
+    <w:bookmarkStart w:id="108" w:name="references"/>
+    <w:p>
+      <w:pPr>
+        <w:pStyle w:val="Heading2"/>
+      </w:pPr>
+      <w:r>
         <w:t xml:space="preserve">References</w:t>
       </w:r>
     </w:p>
-    <w:bookmarkStart w:id="100" w:name="refs"/>
-    <w:bookmarkStart w:id="88" w:name="ref-billingsley1995probability"/>
+    <w:bookmarkStart w:id="107" w:name="refs"/>
+    <w:bookmarkStart w:id="93" w:name="ref-billingsley1995probability"/>
     <w:p>
       <w:pPr>
         <w:pStyle w:val="Bibliography"/>
@@ -73452,8 +76500,8 @@
         <w:t xml:space="preserve">. 3rd ed. Wiley Series in Probability and Mathematical Statistics. Wiley.</w:t>
       </w:r>
     </w:p>
-    <w:bookmarkEnd w:id="88"/>
-    <w:bookmarkStart w:id="90" w:name="ref-CaseBerg01"/>
+    <w:bookmarkEnd w:id="93"/>
+    <w:bookmarkStart w:id="95" w:name="ref-CaseBerg01"/>
     <w:p>
       <w:pPr>
         <w:pStyle w:val="Bibliography"/>
@@ -73477,7 +76525,7 @@
       <w:r>
         <w:t xml:space="preserve"> </w:t>
       </w:r>
-      <w:hyperlink r:id="rId89">
+      <w:hyperlink r:id="rId94">
         <w:r>
           <w:rPr>
             <w:rStyle w:val="Hyperlink"/>
@@ -73489,8 +76537,8 @@
         <w:t xml:space="preserve">.</w:t>
       </w:r>
     </w:p>
-    <w:bookmarkEnd w:id="90"/>
-    <w:bookmarkStart w:id="92" w:name="ref-dobson4e"/>
+    <w:bookmarkEnd w:id="95"/>
+    <w:bookmarkStart w:id="97" w:name="ref-dobson4e"/>
     <w:p>
       <w:pPr>
         <w:pStyle w:val="Bibliography"/>
@@ -73514,7 +76562,7 @@
       <w:r>
         <w:t xml:space="preserve"> </w:t>
       </w:r>
-      <w:hyperlink r:id="rId91">
+      <w:hyperlink r:id="rId96">
         <w:r>
           <w:rPr>
             <w:rStyle w:val="Hyperlink"/>
@@ -73526,8 +76574,8 @@
         <w:t xml:space="preserve">.</w:t>
       </w:r>
     </w:p>
-    <w:bookmarkEnd w:id="92"/>
-    <w:bookmarkStart w:id="94" w:name="ref-gut2013"/>
+    <w:bookmarkEnd w:id="97"/>
+    <w:bookmarkStart w:id="99" w:name="ref-gut2013"/>
     <w:p>
       <w:pPr>
         <w:pStyle w:val="Bibliography"/>
@@ -73551,7 +76599,7 @@
       <w:r>
         <w:t xml:space="preserve"> </w:t>
       </w:r>
-      <w:hyperlink r:id="rId93">
+      <w:hyperlink r:id="rId98">
         <w:r>
           <w:rPr>
             <w:rStyle w:val="Hyperlink"/>
@@ -73563,8 +76611,45 @@
         <w:t xml:space="preserve">.</w:t>
       </w:r>
     </w:p>
-    <w:bookmarkEnd w:id="94"/>
-    <w:bookmarkStart w:id="95" w:name="ref-rudin1976principles"/>
+    <w:bookmarkEnd w:id="99"/>
+    <w:bookmarkStart w:id="101" w:name="ref-hastie2009elements"/>
+    <w:p>
+      <w:pPr>
+        <w:pStyle w:val="Bibliography"/>
+      </w:pPr>
+      <w:r>
+        <w:t xml:space="preserve">Hastie, Trevor, Robert Tibshirani, and Jerome Friedman. 2009.</w:t>
+      </w:r>
+      <w:r>
+        <w:t xml:space="preserve"> </w:t>
+      </w:r>
+      <w:r>
+        <w:rPr>
+          <w:i/>
+          <w:iCs/>
+        </w:rPr>
+        <w:t xml:space="preserve">The Elements of Statistical Learning: Data Mining, Inference, and Prediction</w:t>
+      </w:r>
+      <w:r>
+        <w:t xml:space="preserve">. 2nd ed. Springer.</w:t>
+      </w:r>
+      <w:r>
+        <w:t xml:space="preserve"> </w:t>
+      </w:r>
+      <w:hyperlink r:id="rId100">
+        <w:r>
+          <w:rPr>
+            <w:rStyle w:val="Hyperlink"/>
+          </w:rPr>
+          <w:t xml:space="preserve">https://doi.org/10.1007/978-0-387-84858-7</w:t>
+        </w:r>
+      </w:hyperlink>
+      <w:r>
+        <w:t xml:space="preserve">.</w:t>
+      </w:r>
+    </w:p>
+    <w:bookmarkEnd w:id="101"/>
+    <w:bookmarkStart w:id="102" w:name="ref-rudin1976principles"/>
     <w:p>
       <w:pPr>
         <w:pStyle w:val="Bibliography"/>
@@ -73586,8 +76671,8 @@
         <w:t xml:space="preserve">. 3rd ed. International Series in Pure and Applied Mathematics. McGraw-Hill.</w:t>
       </w:r>
     </w:p>
-    <w:bookmarkEnd w:id="95"/>
-    <w:bookmarkStart w:id="97" w:name="ref-statproofbook:mean-nnrvar"/>
+    <w:bookmarkEnd w:id="102"/>
+    <w:bookmarkStart w:id="104" w:name="ref-statproofbook:mean-nnrvar"/>
     <w:p>
       <w:pPr>
         <w:pStyle w:val="Bibliography"/>
@@ -73611,7 +76696,7 @@
       <w:r>
         <w:t xml:space="preserve"> </w:t>
       </w:r>
-      <w:hyperlink r:id="rId96">
+      <w:hyperlink r:id="rId103">
         <w:r>
           <w:rPr>
             <w:rStyle w:val="Hyperlink"/>
@@ -73623,8 +76708,8 @@
         <w:t xml:space="preserve">.</w:t>
       </w:r>
     </w:p>
-    <w:bookmarkEnd w:id="97"/>
-    <w:bookmarkStart w:id="99" w:name="ref-wp:lotus"/>
+    <w:bookmarkEnd w:id="104"/>
+    <w:bookmarkStart w:id="106" w:name="ref-wp:lotus"/>
     <w:p>
       <w:pPr>
         <w:pStyle w:val="Bibliography"/>
@@ -73683,7 +76768,7 @@
       <w:r>
         <w:t xml:space="preserve"> </w:t>
       </w:r>
-      <w:hyperlink r:id="rId98">
+      <w:hyperlink r:id="rId105">
         <w:r>
           <w:rPr>
             <w:rStyle w:val="Hyperlink"/>
@@ -73695,9 +76780,9 @@
         <w:t xml:space="preserve">.</w:t>
       </w:r>
     </w:p>
-    <w:bookmarkEnd w:id="99"/>
-    <w:bookmarkEnd w:id="100"/>
-    <w:bookmarkEnd w:id="101"/>
+    <w:bookmarkEnd w:id="106"/>
+    <w:bookmarkEnd w:id="107"/>
+    <w:bookmarkEnd w:id="108"/>
     <w:sectPr>
       <w:footnotePr>
         <w:numRestart w:val="eachSect"/>
@@ -73996,6 +77081,91 @@
       </w:rPr>
     </w:lvl>
   </w:abstractNum>
+  <w:abstractNum w:abstractNumId="99411">
+    <w:nsid w:val="00A99411"/>
+    <w:multiLevelType w:val="multilevel"/>
+    <w:lvl w:ilvl="0">
+      <w:start w:val="1"/>
+      <w:numFmt w:val="decimal"/>
+      <w:lvlText w:val="%1."/>
+      <w:lvlJc w:val="left"/>
+      <w:pPr>
+        <w:ind w:left="720" w:hanging="360"/>
+      </w:pPr>
+    </w:lvl>
+    <w:lvl w:ilvl="1">
+      <w:start w:val="1"/>
+      <w:numFmt w:val="decimal"/>
+      <w:lvlText w:val="%2."/>
+      <w:lvlJc w:val="left"/>
+      <w:pPr>
+        <w:ind w:left="1440" w:hanging="360"/>
+      </w:pPr>
+    </w:lvl>
+    <w:lvl w:ilvl="2">
+      <w:start w:val="1"/>
+      <w:numFmt w:val="decimal"/>
+      <w:lvlText w:val="%3."/>
+      <w:lvlJc w:val="left"/>
+      <w:pPr>
+        <w:ind w:left="2160" w:hanging="360"/>
+      </w:pPr>
+    </w:lvl>
+    <w:lvl w:ilvl="3">
+      <w:start w:val="1"/>
+      <w:numFmt w:val="decimal"/>
+      <w:lvlText w:val="%4."/>
+      <w:lvlJc w:val="left"/>
+      <w:pPr>
+        <w:ind w:left="2880" w:hanging="360"/>
+      </w:pPr>
+    </w:lvl>
+    <w:lvl w:ilvl="4">
+      <w:start w:val="1"/>
+      <w:numFmt w:val="decimal"/>
+      <w:lvlText w:val="%5."/>
+      <w:lvlJc w:val="left"/>
+      <w:pPr>
+        <w:ind w:left="3600" w:hanging="360"/>
+      </w:pPr>
+    </w:lvl>
+    <w:lvl w:ilvl="5">
+      <w:start w:val="1"/>
+      <w:numFmt w:val="decimal"/>
+      <w:lvlText w:val="%6."/>
+      <w:lvlJc w:val="left"/>
+      <w:pPr>
+        <w:ind w:left="4320" w:hanging="360"/>
+      </w:pPr>
+    </w:lvl>
+    <w:lvl w:ilvl="6">
+      <w:start w:val="1"/>
+      <w:numFmt w:val="decimal"/>
+      <w:lvlText w:val="%7."/>
+      <w:lvlJc w:val="left"/>
+      <w:pPr>
+        <w:ind w:left="5040" w:hanging="360"/>
+      </w:pPr>
+    </w:lvl>
+    <w:lvl w:ilvl="7">
+      <w:start w:val="1"/>
+      <w:numFmt w:val="decimal"/>
+      <w:lvlText w:val="%8."/>
+      <w:lvlJc w:val="left"/>
+      <w:pPr>
+        <w:ind w:left="5760" w:hanging="360"/>
+      </w:pPr>
+    </w:lvl>
+    <w:lvl w:ilvl="8">
+      <w:start w:val="1"/>
+      <w:numFmt w:val="decimal"/>
+      <w:lvlText w:val="%9."/>
+      <w:lvlJc w:val="left"/>
+      <w:pPr>
+        <w:ind w:left="6480" w:hanging="360"/>
+      </w:pPr>
+    </w:lvl>
+  </w:abstractNum>
   <w:num w:numId="1000">
     <w:abstractNumId w:val="990"/>
   </w:num>
@@ -74061,6 +77231,66 @@
   </w:num>
   <w:num w:numId="1003">
     <w:abstractNumId w:val="991"/>
+  </w:num>
+  <w:num w:numId="1004">
+    <w:abstractNumId w:val="99411"/>
+    <w:lvlOverride w:ilvl="0">
+      <w:startOverride w:val="1"/>
+    </w:lvlOverride>
+    <w:lvlOverride w:ilvl="1">
+      <w:startOverride w:val="1"/>
+    </w:lvlOverride>
+    <w:lvlOverride w:ilvl="2">
+      <w:startOverride w:val="1"/>
+    </w:lvlOverride>
+    <w:lvlOverride w:ilvl="3">
+      <w:startOverride w:val="1"/>
+    </w:lvlOverride>
+    <w:lvlOverride w:ilvl="4">
+      <w:startOverride w:val="1"/>
+    </w:lvlOverride>
+    <w:lvlOverride w:ilvl="5">
+      <w:startOverride w:val="1"/>
+    </w:lvlOverride>
+    <w:lvlOverride w:ilvl="6">
+      <w:startOverride w:val="1"/>
+    </w:lvlOverride>
+    <w:lvlOverride w:ilvl="7">
+      <w:startOverride w:val="1"/>
+    </w:lvlOverride>
+    <w:lvlOverride w:ilvl="8">
+      <w:startOverride w:val="1"/>
+    </w:lvlOverride>
+  </w:num>
+  <w:num w:numId="1005">
+    <w:abstractNumId w:val="99411"/>
+    <w:lvlOverride w:ilvl="0">
+      <w:startOverride w:val="1"/>
+    </w:lvlOverride>
+    <w:lvlOverride w:ilvl="1">
+      <w:startOverride w:val="1"/>
+    </w:lvlOverride>
+    <w:lvlOverride w:ilvl="2">
+      <w:startOverride w:val="1"/>
+    </w:lvlOverride>
+    <w:lvlOverride w:ilvl="3">
+      <w:startOverride w:val="1"/>
+    </w:lvlOverride>
+    <w:lvlOverride w:ilvl="4">
+      <w:startOverride w:val="1"/>
+    </w:lvlOverride>
+    <w:lvlOverride w:ilvl="5">
+      <w:startOverride w:val="1"/>
+    </w:lvlOverride>
+    <w:lvlOverride w:ilvl="6">
+      <w:startOverride w:val="1"/>
+    </w:lvlOverride>
+    <w:lvlOverride w:ilvl="7">
+      <w:startOverride w:val="1"/>
+    </w:lvlOverride>
+    <w:lvlOverride w:ilvl="8">
+      <w:startOverride w:val="1"/>
+    </w:lvlOverride>
   </w:num>
 </w:numbering>
 </file>

</xml_diff>

<commit_message>
Deploying to gh-pages from @ Morrison-Lab/pds@4c5620d033c4f0620775011335e9acf3e33843b6 🚀
</commit_message>
<xml_diff>
--- a/expectation.docx
+++ b/expectation.docx
@@ -15,7 +15,7 @@
         <w:pStyle w:val="Date"/>
       </w:pPr>
       <w:r>
-        <w:t xml:space="preserve">Last modified: 2026-10-06 01:06:46 (PDT)</w:t>
+        <w:t xml:space="preserve">Last modified: 2026-10-06 01:26:45 (PDT)</w:t>
       </w:r>
     </w:p>
     <w:p>
@@ -9583,7 +9583,7 @@
       </m:oMathPara>
     </w:p>
     <w:bookmarkEnd w:id="27"/>
-    <w:bookmarkStart w:id="30" w:name="exm-lotus-continuous"/>
+    <w:bookmarkStart w:id="29" w:name="exm-lotus-continuous"/>
     <w:p>
       <w:pPr>
         <w:pStyle w:val="FirstParagraph"/>
@@ -9793,21 +9793,7 @@
         </m:r>
       </m:oMath>
       <w:r>
-        <w:t xml:space="preserve"> </w:t>
-      </w:r>
-      <w:r>
-        <w:t xml:space="preserve">(</w:t>
-      </w:r>
-      <w:hyperlink r:id="rId29">
-        <w:r>
-          <w:rPr>
-            <w:rStyle w:val="Hyperlink"/>
-          </w:rPr>
-          <w:t xml:space="preserve">uniform density</w:t>
-        </w:r>
-      </w:hyperlink>
-      <w:r>
-        <w:t xml:space="preserve">).</w:t>
+        <w:t xml:space="preserve">.</w:t>
       </w:r>
       <w:r>
         <w:t xml:space="preserve"> </w:t>
@@ -10269,8 +10255,8 @@
         </m:oMath>
       </m:oMathPara>
     </w:p>
-    <w:bookmarkEnd w:id="30"/>
-    <w:bookmarkStart w:id="31" w:name="thm-linearity-expectation"/>
+    <w:bookmarkEnd w:id="29"/>
+    <w:bookmarkStart w:id="30" w:name="thm-linearity-expectation"/>
     <w:p>
       <w:pPr>
         <w:pStyle w:val="FirstParagraph"/>
@@ -10494,7 +10480,7 @@
         </m:oMath>
       </m:oMathPara>
     </w:p>
-    <w:bookmarkEnd w:id="31"/>
+    <w:bookmarkEnd w:id="30"/>
     <w:p>
       <w:pPr>
         <w:pStyle w:val="FirstParagraph"/>
@@ -12480,7 +12466,7 @@
         <w:t xml:space="preserve">which is beyond these notes’ scope.</w:t>
       </w:r>
     </w:p>
-    <w:bookmarkStart w:id="32" w:name="exm-linearity-expectation"/>
+    <w:bookmarkStart w:id="31" w:name="exm-linearity-expectation"/>
     <w:p>
       <w:pPr>
         <w:pStyle w:val="BodyText"/>
@@ -12869,8 +12855,8 @@
         <w:t xml:space="preserve">This calculation does not need the rolls to be independent.</w:t>
       </w:r>
     </w:p>
-    <w:bookmarkEnd w:id="32"/>
-    <w:bookmarkStart w:id="33" w:name="cor-linearity-affine"/>
+    <w:bookmarkEnd w:id="31"/>
+    <w:bookmarkStart w:id="32" w:name="cor-linearity-affine"/>
     <w:p>
       <w:pPr>
         <w:pStyle w:val="BodyText"/>
@@ -13026,7 +13012,7 @@
         </m:oMath>
       </m:oMathPara>
     </w:p>
-    <w:bookmarkEnd w:id="33"/>
+    <w:bookmarkEnd w:id="32"/>
     <w:p>
       <w:pPr>
         <w:pStyle w:val="FirstParagraph"/>
@@ -13970,7 +13956,7 @@
         <w:t xml:space="preserve">and the second because its integrand is a non-negative density.</w:t>
       </w:r>
     </w:p>
-    <w:bookmarkStart w:id="34" w:name="exm-linearity-affine"/>
+    <w:bookmarkStart w:id="33" w:name="exm-linearity-affine"/>
     <w:p>
       <w:pPr>
         <w:pStyle w:val="BodyText"/>
@@ -14444,8 +14430,8 @@
         </m:oMath>
       </m:oMathPara>
     </w:p>
-    <w:bookmarkEnd w:id="34"/>
-    <w:bookmarkStart w:id="35" w:name="exr-linearity-use"/>
+    <w:bookmarkEnd w:id="33"/>
+    <w:bookmarkStart w:id="34" w:name="exr-linearity-use"/>
     <w:p>
       <w:pPr>
         <w:pStyle w:val="FirstParagraph"/>
@@ -14739,8 +14725,8 @@
         <w:t xml:space="preserve">tell us.</w:t>
       </w:r>
     </w:p>
-    <w:bookmarkEnd w:id="35"/>
-    <w:bookmarkStart w:id="36" w:name="sol-linearity-use"/>
+    <w:bookmarkEnd w:id="34"/>
+    <w:bookmarkStart w:id="35" w:name="sol-linearity-use"/>
     <w:p>
       <w:pPr>
         <w:pStyle w:val="BodyText"/>
@@ -15181,8 +15167,8 @@
         <w:t xml:space="preserve">and separating those two statements is foundational to understanding bias and variance.</w:t>
       </w:r>
     </w:p>
-    <w:bookmarkEnd w:id="36"/>
-    <w:bookmarkStart w:id="66" w:name="X1b674fb215c38ba7bf07b336b30c333a3581625"/>
+    <w:bookmarkEnd w:id="35"/>
+    <w:bookmarkStart w:id="65" w:name="X1b674fb215c38ba7bf07b336b30c333a3581625"/>
     <w:p>
       <w:pPr>
         <w:pStyle w:val="Heading2"/>
@@ -15191,7 +15177,7 @@
         <w:t xml:space="preserve">1 Conditional distributions and expectations</w:t>
       </w:r>
     </w:p>
-    <w:bookmarkStart w:id="38" w:name="def-cond-pmf"/>
+    <w:bookmarkStart w:id="37" w:name="def-cond-pmf"/>
     <w:p>
       <w:pPr>
         <w:pStyle w:val="FirstParagraph"/>
@@ -15240,7 +15226,7 @@
       <w:r>
         <w:t xml:space="preserve"> </w:t>
       </w:r>
-      <w:hyperlink r:id="rId37">
+      <w:hyperlink r:id="rId36">
         <w:r>
           <w:rPr>
             <w:rStyle w:val="Hyperlink"/>
@@ -15544,8 +15530,8 @@
         </m:oMath>
       </m:oMathPara>
     </w:p>
-    <w:bookmarkEnd w:id="38"/>
-    <w:bookmarkStart w:id="42" w:name="exm-cond-pmf"/>
+    <w:bookmarkEnd w:id="37"/>
+    <w:bookmarkStart w:id="41" w:name="exm-cond-pmf"/>
     <w:p>
       <w:pPr>
         <w:pStyle w:val="FirstParagraph"/>
@@ -16177,7 +16163,7 @@
       <w:r>
         <w:t xml:space="preserve"> </w:t>
       </w:r>
-      <w:hyperlink r:id="rId39">
+      <w:hyperlink r:id="rId38">
         <w:r>
           <w:rPr>
             <w:rStyle w:val="Hyperlink"/>
@@ -16258,7 +16244,7 @@
       <w:r>
         <w:t xml:space="preserve"> </w:t>
       </w:r>
-      <w:hyperlink r:id="rId40">
+      <w:hyperlink r:id="rId39">
         <w:r>
           <w:rPr>
             <w:rStyle w:val="Hyperlink"/>
@@ -16278,7 +16264,7 @@
       <w:r>
         <w:t xml:space="preserve"> </w:t>
       </w:r>
-      <w:hyperlink r:id="rId41">
+      <w:hyperlink r:id="rId40">
         <w:r>
           <w:rPr>
             <w:rStyle w:val="Hyperlink"/>
@@ -17084,8 +17070,8 @@
         </m:oMath>
       </m:oMathPara>
     </w:p>
-    <w:bookmarkEnd w:id="42"/>
-    <w:bookmarkStart w:id="45" w:name="def-cond-pdf"/>
+    <w:bookmarkEnd w:id="41"/>
+    <w:bookmarkStart w:id="44" w:name="def-cond-pdf"/>
     <w:p>
       <w:pPr>
         <w:pStyle w:val="FirstParagraph"/>
@@ -17140,7 +17126,7 @@
       <w:r>
         <w:t xml:space="preserve"> </w:t>
       </w:r>
-      <w:hyperlink r:id="rId43">
+      <w:hyperlink r:id="rId42">
         <w:r>
           <w:rPr>
             <w:rStyle w:val="Hyperlink"/>
@@ -17213,7 +17199,7 @@
       <w:r>
         <w:t xml:space="preserve"> </w:t>
       </w:r>
-      <w:hyperlink r:id="rId44">
+      <w:hyperlink r:id="rId43">
         <w:r>
           <w:rPr>
             <w:rStyle w:val="Hyperlink"/>
@@ -17549,8 +17535,8 @@
         </m:oMath>
       </m:oMathPara>
     </w:p>
-    <w:bookmarkEnd w:id="45"/>
-    <w:bookmarkStart w:id="47" w:name="exm-cond-pdf"/>
+    <w:bookmarkEnd w:id="44"/>
+    <w:bookmarkStart w:id="46" w:name="exm-cond-pdf"/>
     <w:p>
       <w:pPr>
         <w:pStyle w:val="FirstParagraph"/>
@@ -19296,7 +19282,7 @@
       <w:r>
         <w:t xml:space="preserve"> </w:t>
       </w:r>
-      <w:hyperlink r:id="rId46">
+      <w:hyperlink r:id="rId45">
         <w:r>
           <w:rPr>
             <w:rStyle w:val="Hyperlink"/>
@@ -22541,8 +22527,8 @@
         </w:tc>
       </w:tr>
     </w:tbl>
-    <w:bookmarkEnd w:id="47"/>
-    <w:bookmarkStart w:id="48" w:name="def-cond-expectation"/>
+    <w:bookmarkEnd w:id="46"/>
+    <w:bookmarkStart w:id="47" w:name="def-cond-expectation"/>
     <w:p>
       <w:pPr>
         <w:pStyle w:val="BodyText"/>
@@ -23176,8 +23162,8 @@
         </m:oMath>
       </m:oMathPara>
     </w:p>
-    <w:bookmarkEnd w:id="48"/>
-    <w:bookmarkStart w:id="49" w:name="exm-cond-expectation"/>
+    <w:bookmarkEnd w:id="47"/>
+    <w:bookmarkStart w:id="48" w:name="exm-cond-expectation"/>
     <w:p>
       <w:pPr>
         <w:pStyle w:val="FirstParagraph"/>
@@ -24304,8 +24290,8 @@
         <w:t xml:space="preserve">.</w:t>
       </w:r>
     </w:p>
-    <w:bookmarkEnd w:id="49"/>
-    <w:bookmarkStart w:id="51" w:name="def-cond-mixed"/>
+    <w:bookmarkEnd w:id="48"/>
+    <w:bookmarkStart w:id="50" w:name="def-cond-mixed"/>
     <w:p>
       <w:pPr>
         <w:pStyle w:val="BodyText"/>
@@ -24355,7 +24341,7 @@
       <w:r>
         <w:t xml:space="preserve"> </w:t>
       </w:r>
-      <w:hyperlink r:id="rId50">
+      <w:hyperlink r:id="rId49">
         <w:r>
           <w:rPr>
             <w:rStyle w:val="Hyperlink"/>
@@ -25983,8 +25969,8 @@
         </m:oMath>
       </m:oMathPara>
     </w:p>
-    <w:bookmarkEnd w:id="51"/>
-    <w:bookmarkStart w:id="52" w:name="exm-cond-mixed"/>
+    <w:bookmarkEnd w:id="50"/>
+    <w:bookmarkStart w:id="51" w:name="exm-cond-mixed"/>
     <w:p>
       <w:pPr>
         <w:pStyle w:val="FirstParagraph"/>
@@ -28962,8 +28948,8 @@
         <w:t xml:space="preserve">of senility symptoms.</w:t>
       </w:r>
     </w:p>
-    <w:bookmarkEnd w:id="52"/>
-    <w:bookmarkStart w:id="53" w:name="def-cond-expectation-function"/>
+    <w:bookmarkEnd w:id="51"/>
+    <w:bookmarkStart w:id="52" w:name="def-cond-expectation-function"/>
     <w:p>
       <w:pPr>
         <w:pStyle w:val="BodyText"/>
@@ -29279,8 +29265,8 @@
         <w:t xml:space="preserve">.</w:t>
       </w:r>
     </w:p>
-    <w:bookmarkEnd w:id="53"/>
-    <w:bookmarkStart w:id="54" w:name="exm-cond-expectation-function"/>
+    <w:bookmarkEnd w:id="52"/>
+    <w:bookmarkStart w:id="53" w:name="exm-cond-expectation-function"/>
     <w:p>
       <w:pPr>
         <w:pStyle w:val="BodyText"/>
@@ -29974,8 +29960,8 @@
         </m:oMath>
       </m:oMathPara>
     </w:p>
-    <w:bookmarkEnd w:id="54"/>
-    <w:bookmarkStart w:id="55" w:name="def-cond-expectation-general"/>
+    <w:bookmarkEnd w:id="53"/>
+    <w:bookmarkStart w:id="54" w:name="def-cond-expectation-general"/>
     <w:p>
       <w:pPr>
         <w:pStyle w:val="FirstParagraph"/>
@@ -30873,8 +30859,8 @@
         <w:t xml:space="preserve">.</w:t>
       </w:r>
     </w:p>
-    <w:bookmarkEnd w:id="55"/>
-    <w:bookmarkStart w:id="57" w:name="exm-cond-expectation-general"/>
+    <w:bookmarkEnd w:id="54"/>
+    <w:bookmarkStart w:id="56" w:name="exm-cond-expectation-general"/>
     <w:p>
       <w:pPr>
         <w:pStyle w:val="BodyText"/>
@@ -30895,7 +30881,7 @@
       <w:r>
         <w:t xml:space="preserve"> </w:t>
       </w:r>
-      <w:hyperlink r:id="rId56">
+      <w:hyperlink r:id="rId55">
         <w:r>
           <w:rPr>
             <w:rStyle w:val="Hyperlink"/>
@@ -31472,8 +31458,8 @@
         </m:oMath>
       </m:oMathPara>
     </w:p>
-    <w:bookmarkEnd w:id="57"/>
-    <w:bookmarkStart w:id="58" w:name="cor-cond-expectation-general-y"/>
+    <w:bookmarkEnd w:id="56"/>
+    <w:bookmarkStart w:id="57" w:name="cor-cond-expectation-general-y"/>
     <w:p>
       <w:pPr>
         <w:pStyle w:val="FirstParagraph"/>
@@ -31925,7 +31911,7 @@
         </m:oMath>
       </m:oMathPara>
     </w:p>
-    <w:bookmarkEnd w:id="58"/>
+    <w:bookmarkEnd w:id="57"/>
     <w:p>
       <w:pPr>
         <w:pStyle w:val="FirstParagraph"/>
@@ -32676,7 +32662,7 @@
         <w:t xml:space="preserve">.</w:t>
       </w:r>
     </w:p>
-    <w:bookmarkStart w:id="59" w:name="thm-cond-lotus"/>
+    <w:bookmarkStart w:id="58" w:name="thm-cond-lotus"/>
     <w:p>
       <w:pPr>
         <w:pStyle w:val="BodyText"/>
@@ -33056,7 +33042,7 @@
         <w:t xml:space="preserve">with one sum converging absolutely exactly when the other does.</w:t>
       </w:r>
     </w:p>
-    <w:bookmarkEnd w:id="59"/>
+    <w:bookmarkEnd w:id="58"/>
     <w:p>
       <w:pPr>
         <w:pStyle w:val="BodyText"/>
@@ -36222,7 +36208,7 @@
         <w:t xml:space="preserve">, with the sum or integral taken over both.</w:t>
       </w:r>
     </w:p>
-    <w:bookmarkStart w:id="60" w:name="thm-cond-linearity"/>
+    <w:bookmarkStart w:id="59" w:name="thm-cond-linearity"/>
     <w:p>
       <w:pPr>
         <w:pStyle w:val="BodyText"/>
@@ -36975,7 +36961,7 @@
         <w:t xml:space="preserve">.</w:t>
       </w:r>
     </w:p>
-    <w:bookmarkEnd w:id="60"/>
+    <w:bookmarkEnd w:id="59"/>
     <w:p>
       <w:pPr>
         <w:pStyle w:val="BodyText"/>
@@ -37872,7 +37858,7 @@
         <w:t xml:space="preserve">against one conditional density.</w:t>
       </w:r>
     </w:p>
-    <w:bookmarkStart w:id="61" w:name="exm-cond-linearity"/>
+    <w:bookmarkStart w:id="60" w:name="exm-cond-linearity"/>
     <w:p>
       <w:pPr>
         <w:pStyle w:val="BodyText"/>
@@ -38669,8 +38655,8 @@
         <w:t xml:space="preserve">.</w:t>
       </w:r>
     </w:p>
-    <w:bookmarkEnd w:id="61"/>
-    <w:bookmarkStart w:id="62" w:name="thm-cond-pull-out"/>
+    <w:bookmarkEnd w:id="60"/>
+    <w:bookmarkStart w:id="61" w:name="thm-cond-pull-out"/>
     <w:p>
       <w:pPr>
         <w:pStyle w:val="BodyText"/>
@@ -39332,7 +39318,7 @@
         <w:t xml:space="preserve">.</w:t>
       </w:r>
     </w:p>
-    <w:bookmarkEnd w:id="62"/>
+    <w:bookmarkEnd w:id="61"/>
     <w:p>
       <w:pPr>
         <w:pStyle w:val="BodyText"/>
@@ -40393,7 +40379,7 @@
       <w:r>
         <w:t xml:space="preserve"> </w:t>
       </w:r>
-      <w:hyperlink r:id="rId44">
+      <w:hyperlink r:id="rId43">
         <w:r>
           <w:rPr>
             <w:rStyle w:val="Hyperlink"/>
@@ -40410,7 +40396,7 @@
       <w:r>
         <w:t xml:space="preserve"> </w:t>
       </w:r>
-      <w:hyperlink r:id="rId50">
+      <w:hyperlink r:id="rId49">
         <w:r>
           <w:rPr>
             <w:rStyle w:val="Hyperlink"/>
@@ -40518,7 +40504,7 @@
         <w:t xml:space="preserve">.</w:t>
       </w:r>
     </w:p>
-    <w:bookmarkStart w:id="63" w:name="exm-cond-pull-out"/>
+    <w:bookmarkStart w:id="62" w:name="exm-cond-pull-out"/>
     <w:p>
       <w:pPr>
         <w:pStyle w:val="BodyText"/>
@@ -41126,8 +41112,8 @@
         <w:t xml:space="preserve">each.</w:t>
       </w:r>
     </w:p>
-    <w:bookmarkEnd w:id="63"/>
-    <w:bookmarkStart w:id="64" w:name="exr-fubini-joint-disc"/>
+    <w:bookmarkEnd w:id="62"/>
+    <w:bookmarkStart w:id="63" w:name="exr-fubini-joint-disc"/>
     <w:p>
       <w:pPr>
         <w:pStyle w:val="BodyText"/>
@@ -41432,7 +41418,7 @@
         <w:t xml:space="preserve">.</w:t>
       </w:r>
     </w:p>
-    <w:bookmarkEnd w:id="64"/>
+    <w:bookmarkEnd w:id="63"/>
     <w:p>
       <w:pPr>
         <w:pStyle w:val="BodyText"/>
@@ -42562,7 +42548,7 @@
       <w:tr>
         <w:tc>
           <w:tcPr/>
-          <w:bookmarkStart w:id="65" w:name="fig-fubini-joint-disc"/>
+          <w:bookmarkStart w:id="64" w:name="fig-fubini-joint-disc"/>
           <w:p>
             <w:pPr>
               <w:pStyle w:val="Compact"/>
@@ -42839,7 +42825,7 @@
               <w:t xml:space="preserve">.</w:t>
             </w:r>
           </w:p>
-          <w:bookmarkEnd w:id="65"/>
+          <w:bookmarkEnd w:id="64"/>
         </w:tc>
       </w:tr>
     </w:tbl>
@@ -43155,8 +43141,8 @@
         <w:t xml:space="preserve">which the Fubini–Tonelli theorem provides.</w:t>
       </w:r>
     </w:p>
-    <w:bookmarkEnd w:id="66"/>
-    <w:bookmarkStart w:id="87" w:name="fubinitonelli-for-expectations"/>
+    <w:bookmarkEnd w:id="65"/>
+    <w:bookmarkStart w:id="86" w:name="fubinitonelli-for-expectations"/>
     <w:p>
       <w:pPr>
         <w:pStyle w:val="Heading2"/>
@@ -43165,7 +43151,7 @@
         <w:t xml:space="preserve">2 Fubini–Tonelli for expectations</w:t>
       </w:r>
     </w:p>
-    <w:bookmarkStart w:id="68" w:name="thm-fubini-tonelli-measure"/>
+    <w:bookmarkStart w:id="67" w:name="thm-fubini-tonelli-measure"/>
     <w:p>
       <w:pPr>
         <w:pStyle w:val="FirstParagraph"/>
@@ -43243,7 +43229,7 @@
       <w:r>
         <w:t xml:space="preserve"> </w:t>
       </w:r>
-      <w:hyperlink r:id="rId67">
+      <w:hyperlink r:id="rId66">
         <w:r>
           <w:rPr>
             <w:rStyle w:val="Hyperlink"/>
@@ -44180,7 +44166,7 @@
         <w:t xml:space="preserve">, which does not affect the outer integral.</w:t>
       </w:r>
     </w:p>
-    <w:bookmarkEnd w:id="68"/>
+    <w:bookmarkEnd w:id="67"/>
     <w:p>
       <w:pPr>
         <w:pStyle w:val="BodyText"/>
@@ -44271,7 +44257,7 @@
       <w:r>
         <w:t xml:space="preserve"> </w:t>
       </w:r>
-      <w:hyperlink r:id="rId69">
+      <w:hyperlink r:id="rId68">
         <w:r>
           <w:rPr>
             <w:rStyle w:val="Hyperlink"/>
@@ -44309,7 +44295,7 @@
         <w:t xml:space="preserve">which gives the theorem a form stated in terms of a joint distribution.</w:t>
       </w:r>
     </w:p>
-    <w:bookmarkStart w:id="70" w:name="cor-fubini-joint"/>
+    <w:bookmarkStart w:id="69" w:name="cor-fubini-joint"/>
     <w:p>
       <w:pPr>
         <w:pStyle w:val="BodyText"/>
@@ -45992,7 +45978,7 @@
       <w:r>
         <w:t xml:space="preserve"> </w:t>
       </w:r>
-      <w:hyperlink r:id="rId50">
+      <w:hyperlink r:id="rId49">
         <w:r>
           <w:rPr>
             <w:rStyle w:val="Hyperlink"/>
@@ -46312,7 +46298,7 @@
         <w:t xml:space="preserve">.</w:t>
       </w:r>
     </w:p>
-    <w:bookmarkEnd w:id="70"/>
+    <w:bookmarkEnd w:id="69"/>
     <w:p>
       <w:pPr>
         <w:pStyle w:val="FirstParagraph"/>
@@ -47056,7 +47042,7 @@
         <w:t xml:space="preserve">and the iterated integrals factor into separate integrals over the marginals.</w:t>
       </w:r>
     </w:p>
-    <w:bookmarkStart w:id="71" w:name="exm-fubini-prob"/>
+    <w:bookmarkStart w:id="70" w:name="exm-fubini-prob"/>
     <w:p>
       <w:pPr>
         <w:pStyle w:val="BodyText"/>
@@ -48568,8 +48554,8 @@
         <w:t xml:space="preserve">.</w:t>
       </w:r>
     </w:p>
-    <w:bookmarkEnd w:id="71"/>
-    <w:bookmarkStart w:id="73" w:name="exm-fubini-prob-fail"/>
+    <w:bookmarkEnd w:id="70"/>
+    <w:bookmarkStart w:id="72" w:name="exm-fubini-prob-fail"/>
     <w:p>
       <w:pPr>
         <w:pStyle w:val="BodyText"/>
@@ -51488,7 +51474,7 @@
       <w:tr>
         <w:tc>
           <w:tcPr/>
-          <w:bookmarkStart w:id="72" w:name="fig-fubini-prob-fail"/>
+          <w:bookmarkStart w:id="71" w:name="fig-fubini-prob-fail"/>
           <w:p>
             <w:pPr>
               <w:pStyle w:val="Compact"/>
@@ -51875,12 +51861,12 @@
               <w:t xml:space="preserve">(the grey distribution).</w:t>
             </w:r>
           </w:p>
-          <w:bookmarkEnd w:id="72"/>
+          <w:bookmarkEnd w:id="71"/>
         </w:tc>
       </w:tr>
     </w:tbl>
-    <w:bookmarkEnd w:id="73"/>
-    <w:bookmarkStart w:id="75" w:name="exm-fubini-joint"/>
+    <w:bookmarkEnd w:id="72"/>
+    <w:bookmarkStart w:id="74" w:name="exm-fubini-joint"/>
     <w:p>
       <w:pPr>
         <w:pStyle w:val="BodyText"/>
@@ -52830,7 +52816,7 @@
       <w:tr>
         <w:tc>
           <w:tcPr/>
-          <w:bookmarkStart w:id="74" w:name="fig-fubini-joint"/>
+          <w:bookmarkStart w:id="73" w:name="fig-fubini-joint"/>
           <w:p>
             <w:pPr>
               <w:pStyle w:val="Compact"/>
@@ -53061,12 +53047,12 @@
               <w:t xml:space="preserve">, as required.</w:t>
             </w:r>
           </w:p>
-          <w:bookmarkEnd w:id="74"/>
+          <w:bookmarkEnd w:id="73"/>
         </w:tc>
       </w:tr>
     </w:tbl>
-    <w:bookmarkEnd w:id="75"/>
-    <w:bookmarkStart w:id="76" w:name="thm-lie"/>
+    <w:bookmarkEnd w:id="74"/>
+    <w:bookmarkStart w:id="75" w:name="thm-lie"/>
     <w:p>
       <w:pPr>
         <w:pStyle w:val="BodyText"/>
@@ -53273,7 +53259,7 @@
         </m:oMath>
       </m:oMathPara>
     </w:p>
-    <w:bookmarkEnd w:id="76"/>
+    <w:bookmarkEnd w:id="75"/>
     <w:p>
       <w:pPr>
         <w:pStyle w:val="FirstParagraph"/>
@@ -53422,7 +53408,7 @@
       <w:r>
         <w:t xml:space="preserve"> </w:t>
       </w:r>
-      <w:hyperlink r:id="rId77">
+      <w:hyperlink r:id="rId76">
         <w:r>
           <w:rPr>
             <w:rStyle w:val="Hyperlink"/>
@@ -55890,7 +55876,7 @@
       <w:r>
         <w:t xml:space="preserve"> </w:t>
       </w:r>
-      <w:hyperlink r:id="rId50">
+      <w:hyperlink r:id="rId49">
         <w:r>
           <w:rPr>
             <w:rStyle w:val="Hyperlink"/>
@@ -58244,7 +58230,7 @@
         <w:t xml:space="preserve">.</w:t>
       </w:r>
     </w:p>
-    <w:bookmarkStart w:id="78" w:name="thm-conditional-lie"/>
+    <w:bookmarkStart w:id="77" w:name="thm-conditional-lie"/>
     <w:p>
       <w:pPr>
         <w:pStyle w:val="BodyText"/>
@@ -58486,7 +58472,7 @@
         </m:oMath>
       </m:oMathPara>
     </w:p>
-    <w:bookmarkEnd w:id="78"/>
+    <w:bookmarkEnd w:id="77"/>
     <w:p>
       <w:pPr>
         <w:pStyle w:val="FirstParagraph"/>
@@ -61022,7 +61008,7 @@
         <w:t xml:space="preserve">.</w:t>
       </w:r>
     </w:p>
-    <w:bookmarkStart w:id="79" w:name="exm-lie"/>
+    <w:bookmarkStart w:id="78" w:name="exm-lie"/>
     <w:p>
       <w:pPr>
         <w:pStyle w:val="BodyText"/>
@@ -61749,8 +61735,8 @@
         </m:oMath>
       </m:oMathPara>
     </w:p>
-    <w:bookmarkEnd w:id="79"/>
-    <w:bookmarkStart w:id="80" w:name="exr-fubini-joint-disc-infinite"/>
+    <w:bookmarkEnd w:id="78"/>
+    <w:bookmarkStart w:id="79" w:name="exr-fubini-joint-disc-infinite"/>
     <w:p>
       <w:pPr>
         <w:pStyle w:val="FirstParagraph"/>
@@ -62297,7 +62283,7 @@
         <w:t xml:space="preserve">.</w:t>
       </w:r>
     </w:p>
-    <w:bookmarkEnd w:id="80"/>
+    <w:bookmarkEnd w:id="79"/>
     <w:p>
       <w:pPr>
         <w:pStyle w:val="BodyText"/>
@@ -65757,18 +65743,18 @@
                 <wp:inline>
                   <wp:extent cx="152400" cy="152400"/>
                   <wp:effectExtent b="0" l="0" r="0" t="0"/>
-                  <wp:docPr descr="" title="" id="82" name="Picture"/>
+                  <wp:docPr descr="" title="" id="81" name="Picture"/>
                   <a:graphic>
                     <a:graphicData uri="http://schemas.openxmlformats.org/drawingml/2006/picture">
                       <pic:pic>
                         <pic:nvPicPr>
-                          <pic:cNvPr descr="/opt/quarto/share/formats/docx/note.png" id="83" name="Picture"/>
+                          <pic:cNvPr descr="/opt/quarto/share/formats/docx/note.png" id="82" name="Picture"/>
                           <pic:cNvPicPr>
                             <a:picLocks noChangeArrowheads="1" noChangeAspect="1"/>
                           </pic:cNvPicPr>
                         </pic:nvPicPr>
                         <pic:blipFill>
-                          <a:blip r:embed="rId81"/>
+                          <a:blip r:embed="rId80"/>
                           <a:stretch>
                             <a:fillRect/>
                           </a:stretch>
@@ -66918,7 +66904,7 @@
         </w:tc>
       </w:tr>
     </w:tbl>
-    <w:bookmarkStart w:id="84" w:name="exr-fubini-joint-mixed"/>
+    <w:bookmarkStart w:id="83" w:name="exr-fubini-joint-mixed"/>
     <w:p>
       <w:pPr>
         <w:pStyle w:val="BodyText"/>
@@ -67206,7 +67192,7 @@
         <w:t xml:space="preserve">.</w:t>
       </w:r>
     </w:p>
-    <w:bookmarkEnd w:id="84"/>
+    <w:bookmarkEnd w:id="83"/>
     <w:p>
       <w:pPr>
         <w:pStyle w:val="BodyText"/>
@@ -68732,7 +68718,7 @@
       <w:tr>
         <w:tc>
           <w:tcPr/>
-          <w:bookmarkStart w:id="85" w:name="fig-fubini-joint-mixed"/>
+          <w:bookmarkStart w:id="84" w:name="fig-fubini-joint-mixed"/>
           <w:p>
             <w:pPr>
               <w:pStyle w:val="Compact"/>
@@ -69024,7 +69010,7 @@
               <w:t xml:space="preserve">summing to 1.</w:t>
             </w:r>
           </w:p>
-          <w:bookmarkEnd w:id="85"/>
+          <w:bookmarkEnd w:id="84"/>
         </w:tc>
       </w:tr>
     </w:tbl>
@@ -69336,7 +69322,7 @@
         <w:t xml:space="preserve">’s guarantee would be load-bearing.</w:t>
       </w:r>
     </w:p>
-    <w:bookmarkStart w:id="86" w:name="exr-fubini-joint-mixed-infinite"/>
+    <w:bookmarkStart w:id="85" w:name="exr-fubini-joint-mixed-infinite"/>
     <w:p>
       <w:pPr>
         <w:pStyle w:val="BodyText"/>
@@ -69766,7 +69752,7 @@
         <w:t xml:space="preserve">.</w:t>
       </w:r>
     </w:p>
-    <w:bookmarkEnd w:id="86"/>
+    <w:bookmarkEnd w:id="85"/>
     <w:p>
       <w:pPr>
         <w:pStyle w:val="BodyText"/>
@@ -73419,8 +73405,8 @@
         <w:t xml:space="preserve">.</w:t>
       </w:r>
     </w:p>
-    <w:bookmarkEnd w:id="87"/>
-    <w:bookmarkStart w:id="92" w:name="sec-loss-risk"/>
+    <w:bookmarkEnd w:id="86"/>
+    <w:bookmarkStart w:id="91" w:name="sec-loss-risk"/>
     <w:p>
       <w:pPr>
         <w:pStyle w:val="Heading2"/>
@@ -73429,7 +73415,7 @@
         <w:t xml:space="preserve">3 Loss and risk</w:t>
       </w:r>
     </w:p>
-    <w:bookmarkStart w:id="88" w:name="exr-loss"/>
+    <w:bookmarkStart w:id="87" w:name="exr-loss"/>
     <w:p>
       <w:pPr>
         <w:pStyle w:val="FirstParagraph"/>
@@ -73983,8 +73969,8 @@
         <w:t xml:space="preserve">gives the smaller expected loss under each loss?</w:t>
       </w:r>
     </w:p>
-    <w:bookmarkEnd w:id="88"/>
-    <w:bookmarkStart w:id="89" w:name="sol-loss"/>
+    <w:bookmarkEnd w:id="87"/>
+    <w:bookmarkStart w:id="88" w:name="sol-loss"/>
     <w:p>
       <w:pPr>
         <w:pStyle w:val="FirstParagraph"/>
@@ -75238,8 +75224,8 @@
         </m:oMath>
       </m:oMathPara>
     </w:p>
-    <w:bookmarkEnd w:id="89"/>
-    <w:bookmarkStart w:id="90" w:name="def-loss-function"/>
+    <w:bookmarkEnd w:id="88"/>
+    <w:bookmarkStart w:id="89" w:name="def-loss-function"/>
     <w:p>
       <w:pPr>
         <w:pStyle w:val="FirstParagraph"/>
@@ -75351,7 +75337,7 @@
         <w:t xml:space="preserve">.</w:t>
       </w:r>
     </w:p>
-    <w:bookmarkEnd w:id="90"/>
+    <w:bookmarkEnd w:id="89"/>
     <w:p>
       <w:pPr>
         <w:pStyle w:val="BodyText"/>
@@ -75699,7 +75685,7 @@
         <w:t xml:space="preserve">.</w:t>
       </w:r>
     </w:p>
-    <w:bookmarkStart w:id="91" w:name="def-risk"/>
+    <w:bookmarkStart w:id="90" w:name="def-risk"/>
     <w:p>
       <w:pPr>
         <w:pStyle w:val="BodyText"/>
@@ -75919,7 +75905,7 @@
         </m:oMath>
       </m:oMathPara>
     </w:p>
-    <w:bookmarkEnd w:id="91"/>
+    <w:bookmarkEnd w:id="90"/>
     <w:p>
       <w:pPr>
         <w:pStyle w:val="FirstParagraph"/>
@@ -76467,8 +76453,8 @@
         <w:t xml:space="preserve">This statement is given here without proof.</w:t>
       </w:r>
     </w:p>
-    <w:bookmarkEnd w:id="92"/>
-    <w:bookmarkStart w:id="108" w:name="references"/>
+    <w:bookmarkEnd w:id="91"/>
+    <w:bookmarkStart w:id="107" w:name="references"/>
     <w:p>
       <w:pPr>
         <w:pStyle w:val="Heading2"/>
@@ -76477,8 +76463,8 @@
         <w:t xml:space="preserve">References</w:t>
       </w:r>
     </w:p>
-    <w:bookmarkStart w:id="107" w:name="refs"/>
-    <w:bookmarkStart w:id="93" w:name="ref-billingsley1995probability"/>
+    <w:bookmarkStart w:id="106" w:name="refs"/>
+    <w:bookmarkStart w:id="92" w:name="ref-billingsley1995probability"/>
     <w:p>
       <w:pPr>
         <w:pStyle w:val="Bibliography"/>
@@ -76500,8 +76486,8 @@
         <w:t xml:space="preserve">. 3rd ed. Wiley Series in Probability and Mathematical Statistics. Wiley.</w:t>
       </w:r>
     </w:p>
-    <w:bookmarkEnd w:id="93"/>
-    <w:bookmarkStart w:id="95" w:name="ref-CaseBerg01"/>
+    <w:bookmarkEnd w:id="92"/>
+    <w:bookmarkStart w:id="94" w:name="ref-CaseBerg01"/>
     <w:p>
       <w:pPr>
         <w:pStyle w:val="Bibliography"/>
@@ -76525,7 +76511,7 @@
       <w:r>
         <w:t xml:space="preserve"> </w:t>
       </w:r>
-      <w:hyperlink r:id="rId94">
+      <w:hyperlink r:id="rId93">
         <w:r>
           <w:rPr>
             <w:rStyle w:val="Hyperlink"/>
@@ -76537,8 +76523,8 @@
         <w:t xml:space="preserve">.</w:t>
       </w:r>
     </w:p>
-    <w:bookmarkEnd w:id="95"/>
-    <w:bookmarkStart w:id="97" w:name="ref-dobson4e"/>
+    <w:bookmarkEnd w:id="94"/>
+    <w:bookmarkStart w:id="96" w:name="ref-dobson4e"/>
     <w:p>
       <w:pPr>
         <w:pStyle w:val="Bibliography"/>
@@ -76562,7 +76548,7 @@
       <w:r>
         <w:t xml:space="preserve"> </w:t>
       </w:r>
-      <w:hyperlink r:id="rId96">
+      <w:hyperlink r:id="rId95">
         <w:r>
           <w:rPr>
             <w:rStyle w:val="Hyperlink"/>
@@ -76574,8 +76560,8 @@
         <w:t xml:space="preserve">.</w:t>
       </w:r>
     </w:p>
-    <w:bookmarkEnd w:id="97"/>
-    <w:bookmarkStart w:id="99" w:name="ref-gut2013"/>
+    <w:bookmarkEnd w:id="96"/>
+    <w:bookmarkStart w:id="98" w:name="ref-gut2013"/>
     <w:p>
       <w:pPr>
         <w:pStyle w:val="Bibliography"/>
@@ -76599,7 +76585,7 @@
       <w:r>
         <w:t xml:space="preserve"> </w:t>
       </w:r>
-      <w:hyperlink r:id="rId98">
+      <w:hyperlink r:id="rId97">
         <w:r>
           <w:rPr>
             <w:rStyle w:val="Hyperlink"/>
@@ -76611,8 +76597,8 @@
         <w:t xml:space="preserve">.</w:t>
       </w:r>
     </w:p>
-    <w:bookmarkEnd w:id="99"/>
-    <w:bookmarkStart w:id="101" w:name="ref-hastie2009elements"/>
+    <w:bookmarkEnd w:id="98"/>
+    <w:bookmarkStart w:id="100" w:name="ref-hastie2009elements"/>
     <w:p>
       <w:pPr>
         <w:pStyle w:val="Bibliography"/>
@@ -76636,7 +76622,7 @@
       <w:r>
         <w:t xml:space="preserve"> </w:t>
       </w:r>
-      <w:hyperlink r:id="rId100">
+      <w:hyperlink r:id="rId99">
         <w:r>
           <w:rPr>
             <w:rStyle w:val="Hyperlink"/>
@@ -76648,8 +76634,8 @@
         <w:t xml:space="preserve">.</w:t>
       </w:r>
     </w:p>
-    <w:bookmarkEnd w:id="101"/>
-    <w:bookmarkStart w:id="102" w:name="ref-rudin1976principles"/>
+    <w:bookmarkEnd w:id="100"/>
+    <w:bookmarkStart w:id="101" w:name="ref-rudin1976principles"/>
     <w:p>
       <w:pPr>
         <w:pStyle w:val="Bibliography"/>
@@ -76671,8 +76657,8 @@
         <w:t xml:space="preserve">. 3rd ed. International Series in Pure and Applied Mathematics. McGraw-Hill.</w:t>
       </w:r>
     </w:p>
-    <w:bookmarkEnd w:id="102"/>
-    <w:bookmarkStart w:id="104" w:name="ref-statproofbook:mean-nnrvar"/>
+    <w:bookmarkEnd w:id="101"/>
+    <w:bookmarkStart w:id="103" w:name="ref-statproofbook:mean-nnrvar"/>
     <w:p>
       <w:pPr>
         <w:pStyle w:val="Bibliography"/>
@@ -76696,7 +76682,7 @@
       <w:r>
         <w:t xml:space="preserve"> </w:t>
       </w:r>
-      <w:hyperlink r:id="rId103">
+      <w:hyperlink r:id="rId102">
         <w:r>
           <w:rPr>
             <w:rStyle w:val="Hyperlink"/>
@@ -76708,8 +76694,8 @@
         <w:t xml:space="preserve">.</w:t>
       </w:r>
     </w:p>
-    <w:bookmarkEnd w:id="104"/>
-    <w:bookmarkStart w:id="106" w:name="ref-wp:lotus"/>
+    <w:bookmarkEnd w:id="103"/>
+    <w:bookmarkStart w:id="105" w:name="ref-wp:lotus"/>
     <w:p>
       <w:pPr>
         <w:pStyle w:val="Bibliography"/>
@@ -76768,7 +76754,7 @@
       <w:r>
         <w:t xml:space="preserve"> </w:t>
       </w:r>
-      <w:hyperlink r:id="rId105">
+      <w:hyperlink r:id="rId104">
         <w:r>
           <w:rPr>
             <w:rStyle w:val="Hyperlink"/>
@@ -76780,9 +76766,9 @@
         <w:t xml:space="preserve">.</w:t>
       </w:r>
     </w:p>
+    <w:bookmarkEnd w:id="105"/>
     <w:bookmarkEnd w:id="106"/>
     <w:bookmarkEnd w:id="107"/>
-    <w:bookmarkEnd w:id="108"/>
     <w:sectPr>
       <w:footnotePr>
         <w:numRestart w:val="eachSect"/>

</xml_diff>